<commit_message>
fix: retain disclosure headings in the handbook
</commit_message>
<xml_diff>
--- a/Документы_системы/Система_Прачары.docx
+++ b/Документы_системы/Система_Прачары.docx
@@ -838,6 +838,14 @@
         <w:pStyle w:val="Heading4"/>
       </w:pPr>
       <w:r>
+        <w:t>Дальше — два этапа развития</w:t>
+      </w:r>
+    </w:p>
+    <w:p>
+      <w:pPr>
+        <w:pStyle w:val="Heading4"/>
+      </w:pPr>
+      <w:r>
         <w:t>2. Наладить регулярную работу</w:t>
       </w:r>
     </w:p>
@@ -2845,6 +2853,14 @@
         <w:pStyle w:val="Heading4"/>
       </w:pPr>
       <w:r>
+        <w:t>Дальше — два этапа развития</w:t>
+      </w:r>
+    </w:p>
+    <w:p>
+      <w:pPr>
+        <w:pStyle w:val="Heading4"/>
+      </w:pPr>
+      <w:r>
         <w:t>2. Наладить регулярную работу</w:t>
       </w:r>
     </w:p>
@@ -5490,6 +5506,14 @@
         <w:pStyle w:val="Heading4"/>
       </w:pPr>
       <w:r>
+        <w:t>Дальше — два этапа развития</w:t>
+      </w:r>
+    </w:p>
+    <w:p>
+      <w:pPr>
+        <w:pStyle w:val="Heading4"/>
+      </w:pPr>
+      <w:r>
         <w:t>2. Наладить регулярную работу</w:t>
       </w:r>
     </w:p>
@@ -5944,6 +5968,14 @@
         <w:pStyle w:val="Heading4"/>
       </w:pPr>
       <w:r>
+        <w:t>Человек написал</w:t>
+      </w:r>
+    </w:p>
+    <w:p>
+      <w:pPr>
+        <w:pStyle w:val="Heading4"/>
+      </w:pPr>
+      <w:r>
         <w:t>Результат</w:t>
       </w:r>
     </w:p>
@@ -6321,6 +6353,14 @@
         <w:pStyle w:val="Heading4"/>
       </w:pPr>
       <w:r>
+        <w:t>Человек собирается прийти</w:t>
+      </w:r>
+    </w:p>
+    <w:p>
+      <w:pPr>
+        <w:pStyle w:val="Heading4"/>
+      </w:pPr>
+      <w:r>
         <w:t>Что человек должен знать</w:t>
       </w:r>
     </w:p>
@@ -6546,6 +6586,14 @@
         <w:pStyle w:val="Heading4"/>
       </w:pPr>
       <w:r>
+        <w:t>Человек пришёл впервые</w:t>
+      </w:r>
+    </w:p>
+    <w:p>
+      <w:pPr>
+        <w:pStyle w:val="Heading4"/>
+      </w:pPr>
+      <w:r>
         <w:t>До начала</w:t>
       </w:r>
     </w:p>
@@ -6866,6 +6914,14 @@
           <w:i w:val="0"/>
         </w:rPr>
         <w:t>Человек озвучил потребность → заботник помог сделать следующий шаг.</w:t>
+      </w:r>
+    </w:p>
+    <w:p>
+      <w:pPr>
+        <w:pStyle w:val="Heading4"/>
+      </w:pPr>
+      <w:r>
+        <w:t>После первой встречи</w:t>
       </w:r>
     </w:p>
     <w:p>
@@ -7286,6 +7342,14 @@
       </w:r>
     </w:p>
     <w:p>
+      <w:pPr>
+        <w:pStyle w:val="Heading4"/>
+      </w:pPr>
+      <w:r>
+        <w:t>Человек продолжает приходить</w:t>
+      </w:r>
+    </w:p>
+    <w:p>
       <w:r>
         <w:rPr>
           <w:rFonts w:ascii="Arial" w:hAnsi="Arial" w:eastAsia="Arial" w:cs="Arial"/>
@@ -7541,6 +7605,14 @@
       </w:r>
     </w:p>
     <w:p>
+      <w:pPr>
+        <w:pStyle w:val="Heading4"/>
+      </w:pPr>
+      <w:r>
+        <w:t>Человек не пришёл или пропал</w:t>
+      </w:r>
+    </w:p>
+    <w:p>
       <w:r>
         <w:rPr>
           <w:rFonts w:ascii="Arial" w:hAnsi="Arial" w:eastAsia="Arial" w:cs="Arial"/>
@@ -7916,6 +7988,14 @@
       </w:r>
     </w:p>
     <w:p>
+      <w:pPr>
+        <w:pStyle w:val="Heading4"/>
+      </w:pPr>
+      <w:r>
+        <w:t>Человек стал регулярным</w:t>
+      </w:r>
+    </w:p>
+    <w:p>
       <w:r>
         <w:rPr>
           <w:rFonts w:ascii="Arial" w:hAnsi="Arial" w:eastAsia="Arial" w:cs="Arial"/>
@@ -8126,6 +8206,14 @@
         <w:pStyle w:val="Heading4"/>
       </w:pPr>
       <w:r>
+        <w:t>Человек готов к индивидуальному обучению или инициации</w:t>
+      </w:r>
+    </w:p>
+    <w:p>
+      <w:pPr>
+        <w:pStyle w:val="Heading4"/>
+      </w:pPr>
+      <w:r>
         <w:t>Что сделать</w:t>
       </w:r>
     </w:p>
@@ -8284,6 +8372,14 @@
           <w:i w:val="0"/>
         </w:rPr>
         <w:t>Дальнейшее сопровождение может перейти к соответствующему департаменту. В приложении должно быть понятно, кто теперь отвечает за человека.</w:t>
+      </w:r>
+    </w:p>
+    <w:p>
+      <w:pPr>
+        <w:pStyle w:val="Heading4"/>
+      </w:pPr>
+      <w:r>
+        <w:t>Вести путь в приложении</w:t>
       </w:r>
     </w:p>
     <w:p>
@@ -8538,6 +8634,14 @@
     </w:p>
     <w:p>
       <w:pPr>
+        <w:pStyle w:val="Heading4"/>
+      </w:pPr>
+      <w:r>
+        <w:t>Короткий сценарий первого ответа</w:t>
+      </w:r>
+    </w:p>
+    <w:p>
+      <w:pPr>
         <w:pStyle w:val="Heading3"/>
       </w:pPr>
       <w:r>
@@ -8832,6 +8936,14 @@
       </w:r>
     </w:p>
     <w:p>
+      <w:pPr>
+        <w:pStyle w:val="Heading4"/>
+      </w:pPr>
+      <w:r>
+        <w:t>Поддерживать чат сообщества</w:t>
+      </w:r>
+    </w:p>
+    <w:p>
       <w:r>
         <w:rPr>
           <w:rFonts w:ascii="Arial" w:hAnsi="Arial" w:eastAsia="Arial" w:cs="Arial"/>
@@ -9087,6 +9199,14 @@
       </w:r>
     </w:p>
     <w:p>
+      <w:pPr>
+        <w:pStyle w:val="Heading4"/>
+      </w:pPr>
+      <w:r>
+        <w:t>Провести еженедельную проверку</w:t>
+      </w:r>
+    </w:p>
+    <w:p>
       <w:r>
         <w:rPr>
           <w:rFonts w:ascii="Arial" w:hAnsi="Arial" w:eastAsia="Arial" w:cs="Arial"/>
@@ -9255,6 +9375,14 @@
           <w:i w:val="0"/>
         </w:rPr>
         <w:t>У каждого активного контакта есть ответственный, понятный следующий шаг и дата новой связи.</w:t>
+      </w:r>
+    </w:p>
+    <w:p>
+      <w:pPr>
+        <w:pStyle w:val="Heading4"/>
+      </w:pPr>
+      <w:r>
+        <w:t>Передать запрос или попросить отзыв</w:t>
       </w:r>
     </w:p>
     <w:p>
@@ -9412,6 +9540,14 @@
     </w:p>
     <w:p>
       <w:pPr>
+        <w:pStyle w:val="Heading4"/>
+      </w:pPr>
+      <w:r>
+        <w:t>Соблюдать границы заботы</w:t>
+      </w:r>
+    </w:p>
+    <w:p>
+      <w:pPr>
         <w:pStyle w:val="BulletText"/>
       </w:pPr>
       <w:r>
@@ -9569,6 +9705,14 @@
         <w:pStyle w:val="Heading4"/>
       </w:pPr>
       <w:r>
+        <w:t>Проверить сообщение перед отправкой</w:t>
+      </w:r>
+    </w:p>
+    <w:p>
+      <w:pPr>
+        <w:pStyle w:val="Heading4"/>
+      </w:pPr>
+      <w:r>
         <w:t>Золотой вопрос</w:t>
       </w:r>
     </w:p>
@@ -9952,6 +10096,14 @@
           <w:i w:val="0"/>
         </w:rPr>
         <w:t xml:space="preserve"> копирует только адрес — его можно сразу вставить в сообщение. Обычно достаточно одного подходящего материала.</w:t>
+      </w:r>
+    </w:p>
+    <w:p>
+      <w:pPr>
+        <w:pStyle w:val="Heading4"/>
+      </w:pPr>
+      <w:r>
+        <w:t>КДИ и базовый курс медитации</w:t>
       </w:r>
     </w:p>
     <w:p>
@@ -10015,6 +10167,14 @@
       </w:hyperlink>
     </w:p>
     <w:p>
+      <w:pPr>
+        <w:pStyle w:val="Heading4"/>
+      </w:pPr>
+      <w:r>
+        <w:t>Асаны</w:t>
+      </w:r>
+    </w:p>
+    <w:p>
       <w:r>
         <w:rPr>
           <w:rFonts w:ascii="Arial" w:hAnsi="Arial" w:eastAsia="Arial" w:cs="Arial"/>
@@ -10071,6 +10231,14 @@
       </w:r>
     </w:p>
     <w:p>
+      <w:pPr>
+        <w:pStyle w:val="Heading4"/>
+      </w:pPr>
+      <w:r>
+        <w:t>Питание и рецепты</w:t>
+      </w:r>
+    </w:p>
+    <w:p>
       <w:r>
         <w:rPr>
           <w:rFonts w:ascii="Arial" w:hAnsi="Arial" w:eastAsia="Arial" w:cs="Arial"/>
@@ -10127,6 +10295,14 @@
       </w:r>
     </w:p>
     <w:p>
+      <w:pPr>
+        <w:pStyle w:val="Heading4"/>
+      </w:pPr>
+      <w:r>
+        <w:t>Этические принципы йоги — Яма и Нияма</w:t>
+      </w:r>
+    </w:p>
+    <w:p>
       <w:r>
         <w:rPr>
           <w:rFonts w:ascii="Arial" w:hAnsi="Arial" w:eastAsia="Arial" w:cs="Arial"/>
@@ -10183,6 +10359,14 @@
       </w:r>
     </w:p>
     <w:p>
+      <w:pPr>
+        <w:pStyle w:val="Heading4"/>
+      </w:pPr>
+      <w:r>
+        <w:t>Чакры и биопсихология йоги</w:t>
+      </w:r>
+    </w:p>
+    <w:p>
       <w:r>
         <w:rPr>
           <w:rFonts w:ascii="Arial" w:hAnsi="Arial" w:eastAsia="Arial" w:cs="Arial"/>
@@ -10239,6 +10423,14 @@
       </w:r>
     </w:p>
     <w:p>
+      <w:pPr>
+        <w:pStyle w:val="Heading4"/>
+      </w:pPr>
+      <w:r>
+        <w:t>С чего начать медитацию</w:t>
+      </w:r>
+    </w:p>
+    <w:p>
       <w:r>
         <w:rPr>
           <w:rFonts w:ascii="Arial" w:hAnsi="Arial" w:eastAsia="Arial" w:cs="Arial"/>
@@ -10295,6 +10487,14 @@
       </w:r>
     </w:p>
     <w:p>
+      <w:pPr>
+        <w:pStyle w:val="Heading4"/>
+      </w:pPr>
+      <w:r>
+        <w:t>Другие практики йоги</w:t>
+      </w:r>
+    </w:p>
+    <w:p>
       <w:r>
         <w:rPr>
           <w:rFonts w:ascii="Arial" w:hAnsi="Arial" w:eastAsia="Arial" w:cs="Arial"/>
@@ -10351,6 +10551,14 @@
       </w:r>
     </w:p>
     <w:p>
+      <w:pPr>
+        <w:pStyle w:val="Heading4"/>
+      </w:pPr>
+      <w:r>
+        <w:t>Все плейлисты и каналы проекта</w:t>
+      </w:r>
+    </w:p>
+    <w:p>
       <w:r>
         <w:rPr>
           <w:rFonts w:ascii="Arial" w:hAnsi="Arial" w:eastAsia="Arial" w:cs="Arial"/>
@@ -10729,6 +10937,14 @@
           <w:t>Инструкция: Провести разбор</w:t>
         </w:r>
       </w:hyperlink>
+    </w:p>
+    <w:p>
+      <w:pPr>
+        <w:pStyle w:val="Heading4"/>
+      </w:pPr>
+      <w:r>
+        <w:t>Дальше — два этапа развития</w:t>
+      </w:r>
     </w:p>
     <w:p>
       <w:pPr>

</xml_diff>

<commit_message>
Clarify role focus, minimum requirements and monthly development
</commit_message>
<xml_diff>
--- a/Документы_системы/Система_Прачары.docx
+++ b/Документы_системы/Система_Прачары.docx
@@ -61,7 +61,7 @@
           <w:color w:val="666666"/>
           <w:sz w:val="20"/>
         </w:rPr>
-        <w:t>Дата сборки: 03.10.2026</w:t>
+        <w:t>Дата сборки: 06.10.2026</w:t>
       </w:r>
     </w:p>
     <w:p>
@@ -694,6 +694,24 @@
           <w:b w:val="0"/>
           <w:i w:val="0"/>
         </w:rPr>
+        <w:t>Помогайте новым людям найти практику и решиться прийти.</w:t>
+      </w:r>
+    </w:p>
+    <w:p>
+      <w:pPr>
+        <w:pStyle w:val="Heading4"/>
+      </w:pPr>
+      <w:r>
+        <w:t>Смысл направления</w:t>
+      </w:r>
+    </w:p>
+    <w:p>
+      <w:r>
+        <w:rPr>
+          <w:rFonts w:ascii="Arial" w:hAnsi="Arial" w:eastAsia="Arial" w:cs="Arial"/>
+          <w:b w:val="0"/>
+          <w:i w:val="0"/>
+        </w:rPr>
         <w:t>Создавать условия, при которых новые люди узнают о практике, понимают предложение и делают следующий шаг: пишут, регистрируются или приходят.</w:t>
       </w:r>
     </w:p>
@@ -720,6 +738,197 @@
         <w:pStyle w:val="Heading3"/>
       </w:pPr>
       <w:r>
+        <w:t>Регулярные задачи</w:t>
+      </w:r>
+    </w:p>
+    <w:p>
+      <w:pPr>
+        <w:pStyle w:val="BulletText"/>
+      </w:pPr>
+      <w:r>
+        <w:rPr>
+          <w:rFonts w:ascii="Arial" w:hAnsi="Arial" w:eastAsia="Arial" w:cs="Arial"/>
+          <w:b w:val="0"/>
+          <w:i w:val="0"/>
+        </w:rPr>
+        <w:t xml:space="preserve">• </w:t>
+      </w:r>
+      <w:hyperlink r:id="rId11">
+        <w:r>
+          <w:rPr>
+            <w:color w:val="1F5E4A"/>
+            <w:u w:val="single"/>
+            <w:rFonts w:ascii="Arial" w:hAnsi="Arial" w:eastAsia="Arial" w:cs="Arial"/>
+          </w:rPr>
+          <w:t>Ответы и анонсы</w:t>
+        </w:r>
+      </w:hyperlink>
+    </w:p>
+    <w:p>
+      <w:pPr>
+        <w:pStyle w:val="BulletText"/>
+      </w:pPr>
+      <w:r>
+        <w:rPr>
+          <w:rFonts w:ascii="Arial" w:hAnsi="Arial" w:eastAsia="Arial" w:cs="Arial"/>
+          <w:b w:val="0"/>
+          <w:i w:val="0"/>
+        </w:rPr>
+        <w:t xml:space="preserve">• </w:t>
+      </w:r>
+      <w:hyperlink r:id="rId12">
+        <w:r>
+          <w:rPr>
+            <w:color w:val="1F5E4A"/>
+            <w:u w:val="single"/>
+            <w:rFonts w:ascii="Arial" w:hAnsi="Arial" w:eastAsia="Arial" w:cs="Arial"/>
+          </w:rPr>
+          <w:t>Группы · месяц</w:t>
+        </w:r>
+      </w:hyperlink>
+    </w:p>
+    <w:p>
+      <w:pPr>
+        <w:pStyle w:val="BulletText"/>
+      </w:pPr>
+      <w:r>
+        <w:rPr>
+          <w:rFonts w:ascii="Arial" w:hAnsi="Arial" w:eastAsia="Arial" w:cs="Arial"/>
+          <w:b w:val="0"/>
+          <w:i w:val="0"/>
+        </w:rPr>
+        <w:t xml:space="preserve">• </w:t>
+      </w:r>
+      <w:hyperlink r:id="rId13">
+        <w:r>
+          <w:rPr>
+            <w:color w:val="1F5E4A"/>
+            <w:u w:val="single"/>
+            <w:rFonts w:ascii="Arial" w:hAnsi="Arial" w:eastAsia="Arial" w:cs="Arial"/>
+          </w:rPr>
+          <w:t>Тест · месяц</w:t>
+        </w:r>
+      </w:hyperlink>
+    </w:p>
+    <w:p>
+      <w:pPr>
+        <w:pStyle w:val="Heading4"/>
+      </w:pPr>
+      <w:r>
+        <w:t>Обязательный минимум</w:t>
+      </w:r>
+    </w:p>
+    <w:p>
+      <w:pPr>
+        <w:pStyle w:val="ChecklistText"/>
+      </w:pPr>
+      <w:r>
+        <w:rPr>
+          <w:rFonts w:ascii="Arial" w:hAnsi="Arial" w:eastAsia="Arial" w:cs="Arial"/>
+          <w:b w:val="0"/>
+          <w:i w:val="0"/>
+        </w:rPr>
+        <w:t xml:space="preserve">☐ Оформленная </w:t>
+      </w:r>
+      <w:hyperlink r:id="rId14">
+        <w:r>
+          <w:rPr>
+            <w:color w:val="1F5E4A"/>
+            <w:u w:val="single"/>
+            <w:rFonts w:ascii="Arial" w:hAnsi="Arial" w:eastAsia="Arial" w:cs="Arial"/>
+          </w:rPr>
+          <w:t>группа ВКонтакте</w:t>
+        </w:r>
+      </w:hyperlink>
+      <w:r>
+        <w:rPr>
+          <w:rFonts w:ascii="Arial" w:hAnsi="Arial" w:eastAsia="Arial" w:cs="Arial"/>
+          <w:b w:val="0"/>
+          <w:i w:val="0"/>
+        </w:rPr>
+        <w:t>: город, ближайшая встреча и способ написать.</w:t>
+      </w:r>
+    </w:p>
+    <w:p>
+      <w:pPr>
+        <w:pStyle w:val="ChecklistText"/>
+      </w:pPr>
+      <w:r>
+        <w:rPr>
+          <w:rFonts w:ascii="Arial" w:hAnsi="Arial" w:eastAsia="Arial" w:cs="Arial"/>
+          <w:b w:val="0"/>
+          <w:i w:val="0"/>
+        </w:rPr>
+        <w:t xml:space="preserve">☐ Актуальное </w:t>
+      </w:r>
+      <w:hyperlink r:id="rId15">
+        <w:r>
+          <w:rPr>
+            <w:color w:val="1F5E4A"/>
+            <w:u w:val="single"/>
+            <w:rFonts w:ascii="Arial" w:hAnsi="Arial" w:eastAsia="Arial" w:cs="Arial"/>
+          </w:rPr>
+          <w:t>объявление Avito</w:t>
+        </w:r>
+      </w:hyperlink>
+      <w:r>
+        <w:rPr>
+          <w:rFonts w:ascii="Arial" w:hAnsi="Arial" w:eastAsia="Arial" w:cs="Arial"/>
+          <w:b w:val="0"/>
+          <w:i w:val="0"/>
+        </w:rPr>
+        <w:t xml:space="preserve"> и ответственный за ответы.</w:t>
+      </w:r>
+    </w:p>
+    <w:p>
+      <w:pPr>
+        <w:pStyle w:val="ChecklistText"/>
+      </w:pPr>
+      <w:r>
+        <w:rPr>
+          <w:rFonts w:ascii="Arial" w:hAnsi="Arial" w:eastAsia="Arial" w:cs="Arial"/>
+          <w:b w:val="0"/>
+          <w:i w:val="0"/>
+        </w:rPr>
+        <w:t xml:space="preserve">☐ Анонсы в подходящих </w:t>
+      </w:r>
+      <w:hyperlink r:id="rId12">
+        <w:r>
+          <w:rPr>
+            <w:color w:val="1F5E4A"/>
+            <w:u w:val="single"/>
+            <w:rFonts w:ascii="Arial" w:hAnsi="Arial" w:eastAsia="Arial" w:cs="Arial"/>
+          </w:rPr>
+          <w:t>группах города</w:t>
+        </w:r>
+      </w:hyperlink>
+      <w:r>
+        <w:rPr>
+          <w:rFonts w:ascii="Arial" w:hAnsi="Arial" w:eastAsia="Arial" w:cs="Arial"/>
+          <w:b w:val="0"/>
+          <w:i w:val="0"/>
+        </w:rPr>
+        <w:t xml:space="preserve"> — не реже одного раза в месяц.</w:t>
+      </w:r>
+    </w:p>
+    <w:p>
+      <w:pPr>
+        <w:pStyle w:val="ChecklistText"/>
+      </w:pPr>
+      <w:r>
+        <w:rPr>
+          <w:rFonts w:ascii="Arial" w:hAnsi="Arial" w:eastAsia="Arial" w:cs="Arial"/>
+          <w:b w:val="0"/>
+          <w:i w:val="0"/>
+        </w:rPr>
+        <w:t>☐ Источник обращения и результат передаются заботнику.</w:t>
+      </w:r>
+    </w:p>
+    <w:p>
+      <w:pPr>
+        <w:pStyle w:val="Heading3"/>
+      </w:pPr>
+      <w:r>
         <w:t>Сделать сначала</w:t>
       </w:r>
     </w:p>
@@ -753,7 +962,7 @@
         </w:rPr>
         <w:t xml:space="preserve">1. Уточните ближайшую встречу: дата, место, формат, контакт и условия участия. </w:t>
       </w:r>
-      <w:hyperlink r:id="rId11">
+      <w:hyperlink r:id="rId16">
         <w:r>
           <w:rPr>
             <w:color w:val="1F5E4A"/>
@@ -776,7 +985,7 @@
         </w:rPr>
         <w:t xml:space="preserve">2. Оформите группу ВКонтакте: город, описание, расписание и способ написать. </w:t>
       </w:r>
-      <w:hyperlink r:id="rId12">
+      <w:hyperlink r:id="rId14">
         <w:r>
           <w:rPr>
             <w:color w:val="1F5E4A"/>
@@ -799,7 +1008,7 @@
         </w:rPr>
         <w:t xml:space="preserve">3. Создайте объявление Avito из шаблона. Проверьте дату и контакт. </w:t>
       </w:r>
-      <w:hyperlink r:id="rId13">
+      <w:hyperlink r:id="rId15">
         <w:r>
           <w:rPr>
             <w:color w:val="1F5E4A"/>
@@ -822,7 +1031,7 @@
         </w:rPr>
         <w:t xml:space="preserve">4. Назначьте того, кто отвечает на сообщения и передаёт запрос заботнику. </w:t>
       </w:r>
-      <w:hyperlink r:id="rId14">
+      <w:hyperlink r:id="rId17">
         <w:r>
           <w:rPr>
             <w:color w:val="1F5E4A"/>
@@ -856,7 +1065,7 @@
           <w:b w:val="0"/>
           <w:i w:val="0"/>
         </w:rPr>
-        <w:t>Проверяйте сообщения и актуальность приглашений. Отмечайте, откуда человек узнал о встрече и пришёл ли он. Повторяйте работающие приглашения.</w:t>
+        <w:t>Проверяйте сообщения и актуальность приглашений. Не реже раза в месяц размещайте анонс в подходящих группах города. Отмечайте, откуда человек узнал о встрече и пришёл ли он. Повторяйте работающие приглашения.</w:t>
       </w:r>
     </w:p>
     <w:p>
@@ -892,7 +1101,25 @@
           <w:b w:val="0"/>
           <w:i w:val="0"/>
         </w:rPr>
-        <w:t>Подключайте личный бренд, сайт и визитки по одному инструменту. После каждого проверяйте результат по обращениям и приходам, затем выбирайте следующий. Подробнее — в рабочем порядке инструментов.</w:t>
+        <w:t xml:space="preserve">Каждый месяц проверяйте одну новую рекламную гипотезу: инструмент, площадку или способ приглашения. Запишите ожидаемый результат, проведите тест и сравните обращения и приходы. Поддерживайте работающий минимум; по результату оставьте инструмент, доработайте или остановите. </w:t>
+      </w:r>
+      <w:hyperlink r:id="rId13">
+        <w:r>
+          <w:rPr>
+            <w:color w:val="1F5E4A"/>
+            <w:u w:val="single"/>
+            <w:rFonts w:ascii="Arial" w:hAnsi="Arial" w:eastAsia="Arial" w:cs="Arial"/>
+          </w:rPr>
+          <w:t>Открыть цикл проверки</w:t>
+        </w:r>
+      </w:hyperlink>
+      <w:r>
+        <w:rPr>
+          <w:rFonts w:ascii="Arial" w:hAnsi="Arial" w:eastAsia="Arial" w:cs="Arial"/>
+          <w:b w:val="0"/>
+          <w:i w:val="0"/>
+        </w:rPr>
+        <w:t>.</w:t>
       </w:r>
     </w:p>
     <w:p>
@@ -910,17 +1137,25 @@
         <w:pStyle w:val="Heading3"/>
       </w:pPr>
       <w:r>
-        <w:t>Рабочий порядок инструментов</w:t>
-      </w:r>
-    </w:p>
-    <w:p>
-      <w:r>
-        <w:rPr>
-          <w:rFonts w:ascii="Arial" w:hAnsi="Arial" w:eastAsia="Arial" w:cs="Arial"/>
-          <w:b w:val="0"/>
-          <w:i w:val="0"/>
-        </w:rPr>
-        <w:t>Начинайте с первых пунктов и подключайте следующие, когда предыдущие уже оформлены и поддерживаются. Порядок учитывает доступность и ожидаемую пользу на старте. Реальную эффективность проверяйте по обращениям и посещениям в своём городе.</w:t>
+        <w:t>Как устроены инструменты рекламы</w:t>
+      </w:r>
+    </w:p>
+    <w:p>
+      <w:r>
+        <w:rPr>
+          <w:rFonts w:ascii="Arial" w:hAnsi="Arial" w:eastAsia="Arial" w:cs="Arial"/>
+          <w:b w:val="0"/>
+          <w:i w:val="0"/>
+        </w:rPr>
+        <w:t>Сначала подготовьте место, куда попадёт человек. Затем выберите один способ привлечения и проверьте его по обращениям и приходам.</w:t>
+      </w:r>
+    </w:p>
+    <w:p>
+      <w:pPr>
+        <w:pStyle w:val="Heading4"/>
+      </w:pPr>
+      <w:r>
+        <w:t>Посадочные страницы — куда приводим человека</w:t>
       </w:r>
     </w:p>
     <w:p>
@@ -941,29 +1176,64 @@
           <w:b/>
           <w:i w:val="0"/>
         </w:rPr>
-        <w:t>1. Avito</w:t>
-      </w:r>
-      <w:r>
-        <w:rPr>
-          <w:rFonts w:ascii="Arial" w:hAnsi="Arial" w:eastAsia="Arial" w:cs="Arial"/>
-          <w:b w:val="0"/>
-          <w:i w:val="0"/>
-        </w:rPr>
-        <w:t xml:space="preserve"> быстрый старт</w:t>
-      </w:r>
-    </w:p>
-    <w:p>
-      <w:r>
-        <w:rPr>
-          <w:rFonts w:ascii="Arial" w:hAnsi="Arial" w:eastAsia="Arial" w:cs="Arial"/>
-          <w:b w:val="0"/>
-          <w:i w:val="0"/>
-        </w:rPr>
-        <w:t>Городское объявление с понятным предложением и прямым способом написать.</w:t>
-      </w:r>
-    </w:p>
-    <w:p>
-      <w:hyperlink r:id="rId13">
+        <w:t>Социальные сети:</w:t>
+      </w:r>
+      <w:r>
+        <w:rPr>
+          <w:rFonts w:ascii="Arial" w:hAnsi="Arial" w:eastAsia="Arial" w:cs="Arial"/>
+          <w:b w:val="0"/>
+          <w:i w:val="0"/>
+        </w:rPr>
+        <w:t xml:space="preserve"> понятная группа или страница с городом, расписанием и кнопкой записи. </w:t>
+      </w:r>
+      <w:hyperlink r:id="rId14">
+        <w:r>
+          <w:rPr>
+            <w:color w:val="1F5E4A"/>
+            <w:u w:val="single"/>
+            <w:rFonts w:ascii="Arial" w:hAnsi="Arial" w:eastAsia="Arial" w:cs="Arial"/>
+          </w:rPr>
+          <w:t>Упаковать соцсети</w:t>
+        </w:r>
+      </w:hyperlink>
+      <w:r>
+        <w:rPr>
+          <w:rFonts w:ascii="Arial" w:hAnsi="Arial" w:eastAsia="Arial" w:cs="Arial"/>
+          <w:b w:val="0"/>
+          <w:i w:val="0"/>
+        </w:rPr>
+        <w:t>.</w:t>
+      </w:r>
+    </w:p>
+    <w:p>
+      <w:pPr>
+        <w:pStyle w:val="BulletText"/>
+      </w:pPr>
+      <w:r>
+        <w:rPr>
+          <w:rFonts w:ascii="Arial" w:hAnsi="Arial" w:eastAsia="Arial" w:cs="Arial"/>
+          <w:b w:val="0"/>
+          <w:i w:val="0"/>
+        </w:rPr>
+        <w:t xml:space="preserve">• </w:t>
+      </w:r>
+      <w:r>
+        <w:rPr>
+          <w:rFonts w:ascii="Arial" w:hAnsi="Arial" w:eastAsia="Arial" w:cs="Arial"/>
+          <w:b/>
+          <w:i w:val="0"/>
+        </w:rPr>
+        <w:t>Avito:</w:t>
+      </w:r>
+      <w:r>
+        <w:rPr>
+          <w:rFonts w:ascii="Arial" w:hAnsi="Arial" w:eastAsia="Arial" w:cs="Arial"/>
+          <w:b w:val="0"/>
+          <w:i w:val="0"/>
+        </w:rPr>
+        <w:t xml:space="preserve"> готовое объявление с предложением и прямым контактом. </w:t>
+      </w:r>
+      <w:hyperlink r:id="rId15">
         <w:r>
           <w:rPr>
             <w:color w:val="1F5E4A"/>
@@ -973,6 +1243,14 @@
           <w:t>Инструкция и промпт</w:t>
         </w:r>
       </w:hyperlink>
+      <w:r>
+        <w:rPr>
+          <w:rFonts w:ascii="Arial" w:hAnsi="Arial" w:eastAsia="Arial" w:cs="Arial"/>
+          <w:b w:val="0"/>
+          <w:i w:val="0"/>
+        </w:rPr>
+        <w:t>.</w:t>
+      </w:r>
     </w:p>
     <w:p>
       <w:pPr>
@@ -992,6 +1270,1213 @@
           <w:b/>
           <w:i w:val="0"/>
         </w:rPr>
+        <w:t>Сайт коллективной медитации или программы:</w:t>
+      </w:r>
+      <w:r>
+        <w:rPr>
+          <w:rFonts w:ascii="Arial" w:hAnsi="Arial" w:eastAsia="Arial" w:cs="Arial"/>
+          <w:b w:val="0"/>
+          <w:i w:val="0"/>
+        </w:rPr>
+        <w:t xml:space="preserve"> страница города, место, время, польза, условия участия и способ записаться. </w:t>
+      </w:r>
+      <w:hyperlink r:id="rId18">
+        <w:r>
+          <w:rPr>
+            <w:color w:val="1F5E4A"/>
+            <w:u w:val="single"/>
+            <w:rFonts w:ascii="Arial" w:hAnsi="Arial" w:eastAsia="Arial" w:cs="Arial"/>
+          </w:rPr>
+          <w:t>Подготовить страницу и поиск</w:t>
+        </w:r>
+      </w:hyperlink>
+      <w:r>
+        <w:rPr>
+          <w:rFonts w:ascii="Arial" w:hAnsi="Arial" w:eastAsia="Arial" w:cs="Arial"/>
+          <w:b w:val="0"/>
+          <w:i w:val="0"/>
+        </w:rPr>
+        <w:t>.</w:t>
+      </w:r>
+    </w:p>
+    <w:p>
+      <w:r>
+        <w:rPr>
+          <w:rFonts w:ascii="Arial" w:hAnsi="Arial" w:eastAsia="Arial" w:cs="Arial"/>
+          <w:b w:val="0"/>
+          <w:i w:val="0"/>
+        </w:rPr>
+        <w:t>Проверьте с телефона: человек понимает предложение и может записаться без поиска дополнительной информации.</w:t>
+      </w:r>
+    </w:p>
+    <w:p>
+      <w:pPr>
+        <w:pStyle w:val="Heading4"/>
+      </w:pPr>
+      <w:r>
+        <w:t>Без бюджета — выбираем доступный способ</w:t>
+      </w:r>
+    </w:p>
+    <w:p>
+      <w:pPr>
+        <w:pStyle w:val="BulletText"/>
+      </w:pPr>
+      <w:r>
+        <w:rPr>
+          <w:rFonts w:ascii="Arial" w:hAnsi="Arial" w:eastAsia="Arial" w:cs="Arial"/>
+          <w:b w:val="0"/>
+          <w:i w:val="0"/>
+        </w:rPr>
+        <w:t xml:space="preserve">• </w:t>
+      </w:r>
+      <w:r>
+        <w:rPr>
+          <w:rFonts w:ascii="Arial" w:hAnsi="Arial" w:eastAsia="Arial" w:cs="Arial"/>
+          <w:b/>
+          <w:i w:val="0"/>
+        </w:rPr>
+        <w:t>Личный бренд:</w:t>
+      </w:r>
+      <w:r>
+        <w:rPr>
+          <w:rFonts w:ascii="Arial" w:hAnsi="Arial" w:eastAsia="Arial" w:cs="Arial"/>
+          <w:b w:val="0"/>
+          <w:i w:val="0"/>
+        </w:rPr>
+        <w:t xml:space="preserve"> живой опыт ведущего и организатора помогает доверию. </w:t>
+      </w:r>
+      <w:hyperlink r:id="rId19">
+        <w:r>
+          <w:rPr>
+            <w:color w:val="1F5E4A"/>
+            <w:u w:val="single"/>
+            <w:rFonts w:ascii="Arial" w:hAnsi="Arial" w:eastAsia="Arial" w:cs="Arial"/>
+          </w:rPr>
+          <w:t>Как начать</w:t>
+        </w:r>
+      </w:hyperlink>
+      <w:r>
+        <w:rPr>
+          <w:rFonts w:ascii="Arial" w:hAnsi="Arial" w:eastAsia="Arial" w:cs="Arial"/>
+          <w:b w:val="0"/>
+          <w:i w:val="0"/>
+        </w:rPr>
+        <w:t>.</w:t>
+      </w:r>
+    </w:p>
+    <w:p>
+      <w:pPr>
+        <w:pStyle w:val="BulletText"/>
+      </w:pPr>
+      <w:r>
+        <w:rPr>
+          <w:rFonts w:ascii="Arial" w:hAnsi="Arial" w:eastAsia="Arial" w:cs="Arial"/>
+          <w:b w:val="0"/>
+          <w:i w:val="0"/>
+        </w:rPr>
+        <w:t xml:space="preserve">• </w:t>
+      </w:r>
+      <w:r>
+        <w:rPr>
+          <w:rFonts w:ascii="Arial" w:hAnsi="Arial" w:eastAsia="Arial" w:cs="Arial"/>
+          <w:b/>
+          <w:i w:val="0"/>
+        </w:rPr>
+        <w:t>Бесплатные группы города:</w:t>
+      </w:r>
+      <w:r>
+        <w:rPr>
+          <w:rFonts w:ascii="Arial" w:hAnsi="Arial" w:eastAsia="Arial" w:cs="Arial"/>
+          <w:b w:val="0"/>
+          <w:i w:val="0"/>
+        </w:rPr>
+        <w:t xml:space="preserve"> согласованные анонсы в местных сообществах. </w:t>
+      </w:r>
+      <w:hyperlink r:id="rId12">
+        <w:r>
+          <w:rPr>
+            <w:color w:val="1F5E4A"/>
+            <w:u w:val="single"/>
+            <w:rFonts w:ascii="Arial" w:hAnsi="Arial" w:eastAsia="Arial" w:cs="Arial"/>
+          </w:rPr>
+          <w:t>Ежемесячный порядок</w:t>
+        </w:r>
+      </w:hyperlink>
+      <w:r>
+        <w:rPr>
+          <w:rFonts w:ascii="Arial" w:hAnsi="Arial" w:eastAsia="Arial" w:cs="Arial"/>
+          <w:b w:val="0"/>
+          <w:i w:val="0"/>
+        </w:rPr>
+        <w:t>.</w:t>
+      </w:r>
+    </w:p>
+    <w:p>
+      <w:pPr>
+        <w:pStyle w:val="BulletText"/>
+      </w:pPr>
+      <w:r>
+        <w:rPr>
+          <w:rFonts w:ascii="Arial" w:hAnsi="Arial" w:eastAsia="Arial" w:cs="Arial"/>
+          <w:b w:val="0"/>
+          <w:i w:val="0"/>
+        </w:rPr>
+        <w:t xml:space="preserve">• </w:t>
+      </w:r>
+      <w:r>
+        <w:rPr>
+          <w:rFonts w:ascii="Arial" w:hAnsi="Arial" w:eastAsia="Arial" w:cs="Arial"/>
+          <w:b/>
+          <w:i w:val="0"/>
+        </w:rPr>
+        <w:t>«Сито»:</w:t>
+      </w:r>
+      <w:r>
+        <w:rPr>
+          <w:rFonts w:ascii="Arial" w:hAnsi="Arial" w:eastAsia="Arial" w:cs="Arial"/>
+          <w:b w:val="0"/>
+          <w:i w:val="0"/>
+        </w:rPr>
+        <w:t xml:space="preserve"> инструмент добавлен в структуру. Значение и алгоритм уточняются у команды; инструкция будет дополнена.</w:t>
+      </w:r>
+    </w:p>
+    <w:p>
+      <w:pPr>
+        <w:pStyle w:val="BulletText"/>
+      </w:pPr>
+      <w:r>
+        <w:rPr>
+          <w:rFonts w:ascii="Arial" w:hAnsi="Arial" w:eastAsia="Arial" w:cs="Arial"/>
+          <w:b w:val="0"/>
+          <w:i w:val="0"/>
+        </w:rPr>
+        <w:t xml:space="preserve">• </w:t>
+      </w:r>
+      <w:r>
+        <w:rPr>
+          <w:rFonts w:ascii="Arial" w:hAnsi="Arial" w:eastAsia="Arial" w:cs="Arial"/>
+          <w:b/>
+          <w:i w:val="0"/>
+        </w:rPr>
+        <w:t>Парсинг площадок:</w:t>
+      </w:r>
+      <w:r>
+        <w:rPr>
+          <w:rFonts w:ascii="Arial" w:hAnsi="Arial" w:eastAsia="Arial" w:cs="Arial"/>
+          <w:b w:val="0"/>
+          <w:i w:val="0"/>
+        </w:rPr>
+        <w:t xml:space="preserve"> собрать и отобрать список подходящих городских сообществ. </w:t>
+      </w:r>
+      <w:hyperlink r:id="rId20">
+        <w:r>
+          <w:rPr>
+            <w:color w:val="1F5E4A"/>
+            <w:u w:val="single"/>
+            <w:rFonts w:ascii="Arial" w:hAnsi="Arial" w:eastAsia="Arial" w:cs="Arial"/>
+          </w:rPr>
+          <w:t>Черновик алгоритма и скрипта</w:t>
+        </w:r>
+      </w:hyperlink>
+      <w:r>
+        <w:rPr>
+          <w:rFonts w:ascii="Arial" w:hAnsi="Arial" w:eastAsia="Arial" w:cs="Arial"/>
+          <w:b w:val="0"/>
+          <w:i w:val="0"/>
+        </w:rPr>
+        <w:t>.</w:t>
+      </w:r>
+    </w:p>
+    <w:p>
+      <w:pPr>
+        <w:pStyle w:val="BulletText"/>
+      </w:pPr>
+      <w:r>
+        <w:rPr>
+          <w:rFonts w:ascii="Arial" w:hAnsi="Arial" w:eastAsia="Arial" w:cs="Arial"/>
+          <w:b w:val="0"/>
+          <w:i w:val="0"/>
+        </w:rPr>
+        <w:t xml:space="preserve">• </w:t>
+      </w:r>
+      <w:r>
+        <w:rPr>
+          <w:rFonts w:ascii="Arial" w:hAnsi="Arial" w:eastAsia="Arial" w:cs="Arial"/>
+          <w:b/>
+          <w:i w:val="0"/>
+        </w:rPr>
+        <w:t>Сайт КМ:</w:t>
+      </w:r>
+      <w:r>
+        <w:rPr>
+          <w:rFonts w:ascii="Arial" w:hAnsi="Arial" w:eastAsia="Arial" w:cs="Arial"/>
+          <w:b w:val="0"/>
+          <w:i w:val="0"/>
+        </w:rPr>
+        <w:t xml:space="preserve"> страница коллективной медитации с локальным поиском и понятным приглашением. </w:t>
+      </w:r>
+      <w:hyperlink r:id="rId18">
+        <w:r>
+          <w:rPr>
+            <w:color w:val="1F5E4A"/>
+            <w:u w:val="single"/>
+            <w:rFonts w:ascii="Arial" w:hAnsi="Arial" w:eastAsia="Arial" w:cs="Arial"/>
+          </w:rPr>
+          <w:t>SEO и гео</w:t>
+        </w:r>
+      </w:hyperlink>
+      <w:r>
+        <w:rPr>
+          <w:rFonts w:ascii="Arial" w:hAnsi="Arial" w:eastAsia="Arial" w:cs="Arial"/>
+          <w:b w:val="0"/>
+          <w:i w:val="0"/>
+        </w:rPr>
+        <w:t>.</w:t>
+      </w:r>
+    </w:p>
+    <w:p>
+      <w:pPr>
+        <w:pStyle w:val="BulletText"/>
+      </w:pPr>
+      <w:r>
+        <w:rPr>
+          <w:rFonts w:ascii="Arial" w:hAnsi="Arial" w:eastAsia="Arial" w:cs="Arial"/>
+          <w:b w:val="0"/>
+          <w:i w:val="0"/>
+        </w:rPr>
+        <w:t xml:space="preserve">• </w:t>
+      </w:r>
+      <w:r>
+        <w:rPr>
+          <w:rFonts w:ascii="Arial" w:hAnsi="Arial" w:eastAsia="Arial" w:cs="Arial"/>
+          <w:b/>
+          <w:i w:val="0"/>
+        </w:rPr>
+        <w:t>Личные знакомства и рекомендации:</w:t>
+      </w:r>
+      <w:r>
+        <w:rPr>
+          <w:rFonts w:ascii="Arial" w:hAnsi="Arial" w:eastAsia="Arial" w:cs="Arial"/>
+          <w:b w:val="0"/>
+          <w:i w:val="0"/>
+        </w:rPr>
+        <w:t xml:space="preserve"> приглашайте по интересу человека; визитка помогает продолжить разговор. </w:t>
+      </w:r>
+      <w:hyperlink r:id="rId21">
+        <w:r>
+          <w:rPr>
+            <w:color w:val="1F5E4A"/>
+            <w:u w:val="single"/>
+            <w:rFonts w:ascii="Arial" w:hAnsi="Arial" w:eastAsia="Arial" w:cs="Arial"/>
+          </w:rPr>
+          <w:t>Как давать визитки</w:t>
+        </w:r>
+      </w:hyperlink>
+      <w:r>
+        <w:rPr>
+          <w:rFonts w:ascii="Arial" w:hAnsi="Arial" w:eastAsia="Arial" w:cs="Arial"/>
+          <w:b w:val="0"/>
+          <w:i w:val="0"/>
+        </w:rPr>
+        <w:t>.</w:t>
+      </w:r>
+    </w:p>
+    <w:p>
+      <w:r>
+        <w:rPr>
+          <w:rFonts w:ascii="Arial" w:hAnsi="Arial" w:eastAsia="Arial" w:cs="Arial"/>
+          <w:b w:val="0"/>
+          <w:i w:val="0"/>
+        </w:rPr>
+        <w:t>«Без бюджета» означает без оплаты размещения; подготовка материалов, сайт и работа команды могут требовать ресурсов.</w:t>
+      </w:r>
+    </w:p>
+    <w:p>
+      <w:pPr>
+        <w:pStyle w:val="Heading4"/>
+      </w:pPr>
+      <w:r>
+        <w:t>С бюджетом — подключаем после подготовки страниц</w:t>
+      </w:r>
+    </w:p>
+    <w:p>
+      <w:r>
+        <w:rPr>
+          <w:rFonts w:ascii="Arial" w:hAnsi="Arial" w:eastAsia="Arial" w:cs="Arial"/>
+          <w:b/>
+          <w:i w:val="0"/>
+        </w:rPr>
+        <w:t>Онлайн:</w:t>
+      </w:r>
+      <w:r>
+        <w:rPr>
+          <w:rFonts w:ascii="Arial" w:hAnsi="Arial" w:eastAsia="Arial" w:cs="Arial"/>
+          <w:b w:val="0"/>
+          <w:i w:val="0"/>
+        </w:rPr>
+        <w:t xml:space="preserve"> таргетированная реклама, контекстная реклама, объявления в платных городских и тематических группах, платное продвижение объявлений.</w:t>
+      </w:r>
+    </w:p>
+    <w:p>
+      <w:r>
+        <w:rPr>
+          <w:rFonts w:ascii="Arial" w:hAnsi="Arial" w:eastAsia="Arial" w:cs="Arial"/>
+          <w:b/>
+          <w:i w:val="0"/>
+        </w:rPr>
+        <w:t>Офлайн:</w:t>
+      </w:r>
+      <w:r>
+        <w:rPr>
+          <w:rFonts w:ascii="Arial" w:hAnsi="Arial" w:eastAsia="Arial" w:cs="Arial"/>
+          <w:b w:val="0"/>
+          <w:i w:val="0"/>
+        </w:rPr>
+        <w:t xml:space="preserve"> платные размещения афиш и приглашений, печать визиток и материалов, участие в подходящих городских событиях.</w:t>
+      </w:r>
+    </w:p>
+    <w:p>
+      <w:r>
+        <w:rPr>
+          <w:rFonts w:ascii="Arial" w:hAnsi="Arial" w:eastAsia="Arial" w:cs="Arial"/>
+          <w:b/>
+          <w:i w:val="0"/>
+        </w:rPr>
+        <w:t>Порядок теста:</w:t>
+      </w:r>
+      <w:r>
+        <w:rPr>
+          <w:rFonts w:ascii="Arial" w:hAnsi="Arial" w:eastAsia="Arial" w:cs="Arial"/>
+          <w:b w:val="0"/>
+          <w:i w:val="0"/>
+        </w:rPr>
+        <w:t xml:space="preserve"> выберите аудиторию и предложение → согласуйте сумму и срок → проверьте посадочную страницу → запустите одно размещение → считайте обращения и реальные приходы → решите, продолжать ли. Не подключайте сразу несколько новых источников, если их результат нельзя различить.</w:t>
+      </w:r>
+    </w:p>
+    <w:p>
+      <w:pPr>
+        <w:pStyle w:val="Heading4"/>
+      </w:pPr>
+      <w:r>
+        <w:t>Группы города — действие на каждый месяц</w:t>
+      </w:r>
+    </w:p>
+    <w:p>
+      <w:pPr>
+        <w:pStyle w:val="BulletText"/>
+      </w:pPr>
+      <w:r>
+        <w:rPr>
+          <w:rFonts w:ascii="Arial" w:hAnsi="Arial" w:eastAsia="Arial" w:cs="Arial"/>
+          <w:b w:val="0"/>
+          <w:i w:val="0"/>
+        </w:rPr>
+        <w:t>1. Выберите подходящие сообщества по городу и интересам аудитории.</w:t>
+      </w:r>
+    </w:p>
+    <w:p>
+      <w:pPr>
+        <w:pStyle w:val="BulletText"/>
+      </w:pPr>
+      <w:r>
+        <w:rPr>
+          <w:rFonts w:ascii="Arial" w:hAnsi="Arial" w:eastAsia="Arial" w:cs="Arial"/>
+          <w:b w:val="0"/>
+          <w:i w:val="0"/>
+        </w:rPr>
+        <w:t>2. Проверьте правила публикации и договоритесь с администратором о бесплатном или платном анонсе.</w:t>
+      </w:r>
+    </w:p>
+    <w:p>
+      <w:pPr>
+        <w:pStyle w:val="BulletText"/>
+      </w:pPr>
+      <w:r>
+        <w:rPr>
+          <w:rFonts w:ascii="Arial" w:hAnsi="Arial" w:eastAsia="Arial" w:cs="Arial"/>
+          <w:b w:val="0"/>
+          <w:i w:val="0"/>
+        </w:rPr>
+        <w:t xml:space="preserve">3. Подготовьте приглашение на ближайшую программу. </w:t>
+      </w:r>
+      <w:hyperlink r:id="rId22">
+        <w:r>
+          <w:rPr>
+            <w:color w:val="1F5E4A"/>
+            <w:u w:val="single"/>
+            <w:rFonts w:ascii="Arial" w:hAnsi="Arial" w:eastAsia="Arial" w:cs="Arial"/>
+          </w:rPr>
+          <w:t>Инструкция и промпт анонса</w:t>
+        </w:r>
+      </w:hyperlink>
+      <w:r>
+        <w:rPr>
+          <w:rFonts w:ascii="Arial" w:hAnsi="Arial" w:eastAsia="Arial" w:cs="Arial"/>
+          <w:b w:val="0"/>
+          <w:i w:val="0"/>
+        </w:rPr>
+        <w:t>.</w:t>
+      </w:r>
+    </w:p>
+    <w:p>
+      <w:pPr>
+        <w:pStyle w:val="BulletText"/>
+      </w:pPr>
+      <w:r>
+        <w:rPr>
+          <w:rFonts w:ascii="Arial" w:hAnsi="Arial" w:eastAsia="Arial" w:cs="Arial"/>
+          <w:b w:val="0"/>
+          <w:i w:val="0"/>
+        </w:rPr>
+        <w:t>4. Разместите согласованный анонс не реже раза в месяц и отвечайте на вопросы.</w:t>
+      </w:r>
+    </w:p>
+    <w:p>
+      <w:pPr>
+        <w:pStyle w:val="BulletText"/>
+      </w:pPr>
+      <w:r>
+        <w:rPr>
+          <w:rFonts w:ascii="Arial" w:hAnsi="Arial" w:eastAsia="Arial" w:cs="Arial"/>
+          <w:b w:val="0"/>
+          <w:i w:val="0"/>
+        </w:rPr>
+        <w:t>5. Запишите площадку, дату, условия, обращения и приходы. Сохраните удачные площадки для следующего месяца.</w:t>
+      </w:r>
+    </w:p>
+    <w:p>
+      <w:pPr>
+        <w:pStyle w:val="Heading4"/>
+      </w:pPr>
+      <w:r>
+        <w:t>Гипотеза месяца — пробуем и делаем вывод</w:t>
+      </w:r>
+    </w:p>
+    <w:p>
+      <w:pPr>
+        <w:pStyle w:val="BulletText"/>
+      </w:pPr>
+      <w:r>
+        <w:rPr>
+          <w:rFonts w:ascii="Arial" w:hAnsi="Arial" w:eastAsia="Arial" w:cs="Arial"/>
+          <w:b w:val="0"/>
+          <w:i w:val="0"/>
+        </w:rPr>
+        <w:t xml:space="preserve">1. </w:t>
+      </w:r>
+      <w:r>
+        <w:rPr>
+          <w:rFonts w:ascii="Arial" w:hAnsi="Arial" w:eastAsia="Arial" w:cs="Arial"/>
+          <w:b/>
+          <w:i w:val="0"/>
+        </w:rPr>
+        <w:t>Выберите один тест:</w:t>
+      </w:r>
+      <w:r>
+        <w:rPr>
+          <w:rFonts w:ascii="Arial" w:hAnsi="Arial" w:eastAsia="Arial" w:cs="Arial"/>
+          <w:b w:val="0"/>
+          <w:i w:val="0"/>
+        </w:rPr>
+        <w:t xml:space="preserve"> новый инструмент, группу, аудиторию или вариант приглашения.</w:t>
+      </w:r>
+    </w:p>
+    <w:p>
+      <w:pPr>
+        <w:pStyle w:val="BulletText"/>
+      </w:pPr>
+      <w:r>
+        <w:rPr>
+          <w:rFonts w:ascii="Arial" w:hAnsi="Arial" w:eastAsia="Arial" w:cs="Arial"/>
+          <w:b w:val="0"/>
+          <w:i w:val="0"/>
+        </w:rPr>
+        <w:t xml:space="preserve">2. </w:t>
+      </w:r>
+      <w:r>
+        <w:rPr>
+          <w:rFonts w:ascii="Arial" w:hAnsi="Arial" w:eastAsia="Arial" w:cs="Arial"/>
+          <w:b/>
+          <w:i w:val="0"/>
+        </w:rPr>
+        <w:t>Запишите гипотезу:</w:t>
+      </w:r>
+      <w:r>
+        <w:rPr>
+          <w:rFonts w:ascii="Arial" w:hAnsi="Arial" w:eastAsia="Arial" w:cs="Arial"/>
+          <w:b w:val="0"/>
+          <w:i w:val="0"/>
+        </w:rPr>
+        <w:t xml:space="preserve"> «Если сделать [действие] для [аудитория], то получим [ожидаемые обращения и приходы]».</w:t>
+      </w:r>
+    </w:p>
+    <w:p>
+      <w:pPr>
+        <w:pStyle w:val="BulletText"/>
+      </w:pPr>
+      <w:r>
+        <w:rPr>
+          <w:rFonts w:ascii="Arial" w:hAnsi="Arial" w:eastAsia="Arial" w:cs="Arial"/>
+          <w:b w:val="0"/>
+          <w:i w:val="0"/>
+        </w:rPr>
+        <w:t xml:space="preserve">3. </w:t>
+      </w:r>
+      <w:r>
+        <w:rPr>
+          <w:rFonts w:ascii="Arial" w:hAnsi="Arial" w:eastAsia="Arial" w:cs="Arial"/>
+          <w:b/>
+          <w:i w:val="0"/>
+        </w:rPr>
+        <w:t>Определите ответственного, срок и бюджет:</w:t>
+      </w:r>
+      <w:r>
+        <w:rPr>
+          <w:rFonts w:ascii="Arial" w:hAnsi="Arial" w:eastAsia="Arial" w:cs="Arial"/>
+          <w:b w:val="0"/>
+          <w:i w:val="0"/>
+        </w:rPr>
+        <w:t xml:space="preserve"> для бесплатного размещения бюджет — 0.</w:t>
+      </w:r>
+    </w:p>
+    <w:p>
+      <w:pPr>
+        <w:pStyle w:val="BulletText"/>
+      </w:pPr>
+      <w:r>
+        <w:rPr>
+          <w:rFonts w:ascii="Arial" w:hAnsi="Arial" w:eastAsia="Arial" w:cs="Arial"/>
+          <w:b w:val="0"/>
+          <w:i w:val="0"/>
+        </w:rPr>
+        <w:t xml:space="preserve">4. </w:t>
+      </w:r>
+      <w:r>
+        <w:rPr>
+          <w:rFonts w:ascii="Arial" w:hAnsi="Arial" w:eastAsia="Arial" w:cs="Arial"/>
+          <w:b/>
+          <w:i w:val="0"/>
+        </w:rPr>
+        <w:t>Проведите тест:</w:t>
+      </w:r>
+      <w:r>
+        <w:rPr>
+          <w:rFonts w:ascii="Arial" w:hAnsi="Arial" w:eastAsia="Arial" w:cs="Arial"/>
+          <w:b w:val="0"/>
+          <w:i w:val="0"/>
+        </w:rPr>
+        <w:t xml:space="preserve"> отметьте источник каждого обращения и передайте контакт заботнику.</w:t>
+      </w:r>
+    </w:p>
+    <w:p>
+      <w:pPr>
+        <w:pStyle w:val="BulletText"/>
+      </w:pPr>
+      <w:r>
+        <w:rPr>
+          <w:rFonts w:ascii="Arial" w:hAnsi="Arial" w:eastAsia="Arial" w:cs="Arial"/>
+          <w:b w:val="0"/>
+          <w:i w:val="0"/>
+        </w:rPr>
+        <w:t xml:space="preserve">5. </w:t>
+      </w:r>
+      <w:r>
+        <w:rPr>
+          <w:rFonts w:ascii="Arial" w:hAnsi="Arial" w:eastAsia="Arial" w:cs="Arial"/>
+          <w:b/>
+          <w:i w:val="0"/>
+        </w:rPr>
+        <w:t>Разберите результат:</w:t>
+      </w:r>
+      <w:r>
+        <w:rPr>
+          <w:rFonts w:ascii="Arial" w:hAnsi="Arial" w:eastAsia="Arial" w:cs="Arial"/>
+          <w:b w:val="0"/>
+          <w:i w:val="0"/>
+        </w:rPr>
+        <w:t xml:space="preserve"> сколько людей написало, пришло и что помогло. Решение — повторить, изменить или остановить.</w:t>
+      </w:r>
+    </w:p>
+    <w:p>
+      <w:pPr>
+        <w:pStyle w:val="BulletText"/>
+      </w:pPr>
+      <w:r>
+        <w:rPr>
+          <w:rFonts w:ascii="Arial" w:hAnsi="Arial" w:eastAsia="Arial" w:cs="Arial"/>
+          <w:b w:val="0"/>
+          <w:i w:val="0"/>
+        </w:rPr>
+        <w:t xml:space="preserve">6. </w:t>
+      </w:r>
+      <w:r>
+        <w:rPr>
+          <w:rFonts w:ascii="Arial" w:hAnsi="Arial" w:eastAsia="Arial" w:cs="Arial"/>
+          <w:b/>
+          <w:i w:val="0"/>
+        </w:rPr>
+        <w:t>Сохраните вывод:</w:t>
+      </w:r>
+      <w:r>
+        <w:rPr>
+          <w:rFonts w:ascii="Arial" w:hAnsi="Arial" w:eastAsia="Arial" w:cs="Arial"/>
+          <w:b w:val="0"/>
+          <w:i w:val="0"/>
+        </w:rPr>
+        <w:t xml:space="preserve"> рабочий инструмент продолжайте поддерживать; на следующий месяц выберите новый тест.</w:t>
+      </w:r>
+    </w:p>
+    <w:p>
+      <w:r>
+        <w:rPr>
+          <w:rFonts w:ascii="Arial" w:hAnsi="Arial" w:eastAsia="Arial" w:cs="Arial"/>
+          <w:b w:val="0"/>
+          <w:i w:val="0"/>
+        </w:rPr>
+        <w:t xml:space="preserve">Шаблон записи: </w:t>
+      </w:r>
+      <w:r>
+        <w:rPr>
+          <w:rFonts w:ascii="Arial" w:hAnsi="Arial" w:eastAsia="Arial" w:cs="Arial"/>
+          <w:b/>
+          <w:i w:val="0"/>
+        </w:rPr>
+        <w:t>месяц → гипотеза → действие → ответственный → бюджет → обращения → приходы → вывод → следующий шаг</w:t>
+      </w:r>
+      <w:r>
+        <w:rPr>
+          <w:rFonts w:ascii="Arial" w:hAnsi="Arial" w:eastAsia="Arial" w:cs="Arial"/>
+          <w:b w:val="0"/>
+          <w:i w:val="0"/>
+        </w:rPr>
+        <w:t>. Плановые числа команда выбирает по ситуации города.</w:t>
+      </w:r>
+    </w:p>
+    <w:p>
+      <w:pPr>
+        <w:pStyle w:val="Heading4"/>
+      </w:pPr>
+      <w:r>
+        <w:t>Парсинг площадок — черновик алгоритма и скрипта</w:t>
+      </w:r>
+    </w:p>
+    <w:p>
+      <w:r>
+        <w:rPr>
+          <w:rFonts w:ascii="Arial" w:hAnsi="Arial" w:eastAsia="Arial" w:cs="Arial"/>
+          <w:b/>
+          <w:i w:val="0"/>
+        </w:rPr>
+        <w:t>Задача:</w:t>
+      </w:r>
+      <w:r>
+        <w:rPr>
+          <w:rFonts w:ascii="Arial" w:hAnsi="Arial" w:eastAsia="Arial" w:cs="Arial"/>
+          <w:b w:val="0"/>
+          <w:i w:val="0"/>
+        </w:rPr>
+        <w:t xml:space="preserve"> быстро подготовить список городских площадок для выбора размещений. Это рабочая заготовка, которую уточним под выбранную площадку.</w:t>
+      </w:r>
+    </w:p>
+    <w:p>
+      <w:pPr>
+        <w:pStyle w:val="BulletText"/>
+      </w:pPr>
+      <w:r>
+        <w:rPr>
+          <w:rFonts w:ascii="Arial" w:hAnsi="Arial" w:eastAsia="Arial" w:cs="Arial"/>
+          <w:b w:val="0"/>
+          <w:i w:val="0"/>
+        </w:rPr>
+        <w:t>1. Определите город, темы и тип сообществ.</w:t>
+      </w:r>
+    </w:p>
+    <w:p>
+      <w:pPr>
+        <w:pStyle w:val="BulletText"/>
+      </w:pPr>
+      <w:r>
+        <w:rPr>
+          <w:rFonts w:ascii="Arial" w:hAnsi="Arial" w:eastAsia="Arial" w:cs="Arial"/>
+          <w:b w:val="0"/>
+          <w:i w:val="0"/>
+        </w:rPr>
+        <w:t xml:space="preserve">2. Получите доступный каталог или выгрузку площадок: название, город, описание, ссылка. Сохраните CSV с полями </w:t>
+      </w:r>
+      <w:r>
+        <w:rPr>
+          <w:rFonts w:ascii="Consolas" w:hAnsi="Consolas" w:eastAsia="Consolas" w:cs="Consolas"/>
+          <w:color w:val="333333"/>
+          <w:sz w:val="18"/>
+        </w:rPr>
+        <w:t>name,city,description,url</w:t>
+      </w:r>
+      <w:r>
+        <w:rPr>
+          <w:rFonts w:ascii="Arial" w:hAnsi="Arial" w:eastAsia="Arial" w:cs="Arial"/>
+          <w:b w:val="0"/>
+          <w:i w:val="0"/>
+        </w:rPr>
+        <w:t>.</w:t>
+      </w:r>
+    </w:p>
+    <w:p>
+      <w:pPr>
+        <w:pStyle w:val="BulletText"/>
+      </w:pPr>
+      <w:r>
+        <w:rPr>
+          <w:rFonts w:ascii="Arial" w:hAnsi="Arial" w:eastAsia="Arial" w:cs="Arial"/>
+          <w:b w:val="0"/>
+          <w:i w:val="0"/>
+        </w:rPr>
+        <w:t>3. Отберите город и темы скриптом ниже; уберите повторы по ссылке.</w:t>
+      </w:r>
+    </w:p>
+    <w:p>
+      <w:pPr>
+        <w:pStyle w:val="BulletText"/>
+      </w:pPr>
+      <w:r>
+        <w:rPr>
+          <w:rFonts w:ascii="Arial" w:hAnsi="Arial" w:eastAsia="Arial" w:cs="Arial"/>
+          <w:b w:val="0"/>
+          <w:i w:val="0"/>
+        </w:rPr>
+        <w:t>4. Вручную проверьте актуальность группы, аудиторию и условия анонса.</w:t>
+      </w:r>
+    </w:p>
+    <w:p>
+      <w:pPr>
+        <w:pStyle w:val="BulletText"/>
+      </w:pPr>
+      <w:r>
+        <w:rPr>
+          <w:rFonts w:ascii="Arial" w:hAnsi="Arial" w:eastAsia="Arial" w:cs="Arial"/>
+          <w:b w:val="0"/>
+          <w:i w:val="0"/>
+        </w:rPr>
+        <w:t>5. Согласуйте размещение с администратором и внесите площадку в тест месяца.</w:t>
+      </w:r>
+    </w:p>
+    <w:p>
+      <w:pPr>
+        <w:pStyle w:val="Heading4"/>
+      </w:pPr>
+      <w:r>
+        <w:t>Скрипт отбора готовой выгрузки</w:t>
+      </w:r>
+    </w:p>
+    <w:p>
+      <w:r>
+        <w:rPr>
+          <w:rFonts w:ascii="Arial" w:hAnsi="Arial" w:eastAsia="Arial" w:cs="Arial"/>
+          <w:b w:val="0"/>
+          <w:i w:val="0"/>
+        </w:rPr>
+        <w:t>Скрипт разбирает CSV, фильтрует по городу и теме, сохраняет список площадок. Получение данных с конкретной платформы добавим после выбора источника.</w:t>
+      </w:r>
+    </w:p>
+    <w:p>
+      <w:pPr>
+        <w:pStyle w:val="CodeText"/>
+      </w:pPr>
+      <w:r>
+        <w:rPr>
+          <w:rFonts w:ascii="Consolas" w:hAnsi="Consolas" w:eastAsia="Consolas" w:cs="Consolas"/>
+          <w:sz w:val="17"/>
+        </w:rPr>
+        <w:t>import csv</w:t>
+      </w:r>
+    </w:p>
+    <w:p>
+      <w:pPr>
+        <w:pStyle w:val="CodeText"/>
+      </w:pPr>
+      <w:r>
+        <w:rPr>
+          <w:rFonts w:ascii="Consolas" w:hAnsi="Consolas" w:eastAsia="Consolas" w:cs="Consolas"/>
+          <w:sz w:val="17"/>
+        </w:rPr>
+      </w:r>
+    </w:p>
+    <w:p>
+      <w:pPr>
+        <w:pStyle w:val="CodeText"/>
+      </w:pPr>
+      <w:r>
+        <w:rPr>
+          <w:rFonts w:ascii="Consolas" w:hAnsi="Consolas" w:eastAsia="Consolas" w:cs="Consolas"/>
+          <w:sz w:val="17"/>
+        </w:rPr>
+        <w:t>CITY = "Екатеринбург"  # замените на свой город</w:t>
+      </w:r>
+    </w:p>
+    <w:p>
+      <w:pPr>
+        <w:pStyle w:val="CodeText"/>
+      </w:pPr>
+      <w:r>
+        <w:rPr>
+          <w:rFonts w:ascii="Consolas" w:hAnsi="Consolas" w:eastAsia="Consolas" w:cs="Consolas"/>
+          <w:sz w:val="17"/>
+        </w:rPr>
+        <w:t>TOPICS = ("йога", "медитация", "афиша", "события")</w:t>
+      </w:r>
+    </w:p>
+    <w:p>
+      <w:pPr>
+        <w:pStyle w:val="CodeText"/>
+      </w:pPr>
+      <w:r>
+        <w:rPr>
+          <w:rFonts w:ascii="Consolas" w:hAnsi="Consolas" w:eastAsia="Consolas" w:cs="Consolas"/>
+          <w:sz w:val="17"/>
+        </w:rPr>
+        <w:t>seen = set()</w:t>
+      </w:r>
+    </w:p>
+    <w:p>
+      <w:pPr>
+        <w:pStyle w:val="CodeText"/>
+      </w:pPr>
+      <w:r>
+        <w:rPr>
+          <w:rFonts w:ascii="Consolas" w:hAnsi="Consolas" w:eastAsia="Consolas" w:cs="Consolas"/>
+          <w:sz w:val="17"/>
+        </w:rPr>
+        <w:t>with open("groups.csv", encoding="utf-8-sig", newline="") as source:</w:t>
+      </w:r>
+    </w:p>
+    <w:p>
+      <w:pPr>
+        <w:pStyle w:val="CodeText"/>
+      </w:pPr>
+      <w:r>
+        <w:rPr>
+          <w:rFonts w:ascii="Consolas" w:hAnsi="Consolas" w:eastAsia="Consolas" w:cs="Consolas"/>
+          <w:sz w:val="17"/>
+        </w:rPr>
+        <w:t xml:space="preserve">    rows = csv.DictReader(source)</w:t>
+      </w:r>
+    </w:p>
+    <w:p>
+      <w:pPr>
+        <w:pStyle w:val="CodeText"/>
+      </w:pPr>
+      <w:r>
+        <w:rPr>
+          <w:rFonts w:ascii="Consolas" w:hAnsi="Consolas" w:eastAsia="Consolas" w:cs="Consolas"/>
+          <w:sz w:val="17"/>
+        </w:rPr>
+        <w:t xml:space="preserve">    with open("groups_shortlist.csv", "w", encoding="utf-8-sig", newline="") as target:</w:t>
+      </w:r>
+    </w:p>
+    <w:p>
+      <w:pPr>
+        <w:pStyle w:val="CodeText"/>
+      </w:pPr>
+      <w:r>
+        <w:rPr>
+          <w:rFonts w:ascii="Consolas" w:hAnsi="Consolas" w:eastAsia="Consolas" w:cs="Consolas"/>
+          <w:sz w:val="17"/>
+        </w:rPr>
+        <w:t xml:space="preserve">        fields = ["name", "city", "description", "url"]</w:t>
+      </w:r>
+    </w:p>
+    <w:p>
+      <w:pPr>
+        <w:pStyle w:val="CodeText"/>
+      </w:pPr>
+      <w:r>
+        <w:rPr>
+          <w:rFonts w:ascii="Consolas" w:hAnsi="Consolas" w:eastAsia="Consolas" w:cs="Consolas"/>
+          <w:sz w:val="17"/>
+        </w:rPr>
+        <w:t xml:space="preserve">        writer = csv.DictWriter(target, fieldnames=fields)</w:t>
+      </w:r>
+    </w:p>
+    <w:p>
+      <w:pPr>
+        <w:pStyle w:val="CodeText"/>
+      </w:pPr>
+      <w:r>
+        <w:rPr>
+          <w:rFonts w:ascii="Consolas" w:hAnsi="Consolas" w:eastAsia="Consolas" w:cs="Consolas"/>
+          <w:sz w:val="17"/>
+        </w:rPr>
+        <w:t xml:space="preserve">        writer.writeheader()</w:t>
+      </w:r>
+    </w:p>
+    <w:p>
+      <w:pPr>
+        <w:pStyle w:val="CodeText"/>
+      </w:pPr>
+      <w:r>
+        <w:rPr>
+          <w:rFonts w:ascii="Consolas" w:hAnsi="Consolas" w:eastAsia="Consolas" w:cs="Consolas"/>
+          <w:sz w:val="17"/>
+        </w:rPr>
+        <w:t xml:space="preserve">        for row in rows:</w:t>
+      </w:r>
+    </w:p>
+    <w:p>
+      <w:pPr>
+        <w:pStyle w:val="CodeText"/>
+      </w:pPr>
+      <w:r>
+        <w:rPr>
+          <w:rFonts w:ascii="Consolas" w:hAnsi="Consolas" w:eastAsia="Consolas" w:cs="Consolas"/>
+          <w:sz w:val="17"/>
+        </w:rPr>
+        <w:t xml:space="preserve">            url = row.get("url", "").strip().rstrip("/")</w:t>
+      </w:r>
+    </w:p>
+    <w:p>
+      <w:pPr>
+        <w:pStyle w:val="CodeText"/>
+      </w:pPr>
+      <w:r>
+        <w:rPr>
+          <w:rFonts w:ascii="Consolas" w:hAnsi="Consolas" w:eastAsia="Consolas" w:cs="Consolas"/>
+          <w:sz w:val="17"/>
+        </w:rPr>
+        <w:t xml:space="preserve">            text = (row.get("name", "") + " " + row.get("description", "")).lower()</w:t>
+      </w:r>
+    </w:p>
+    <w:p>
+      <w:pPr>
+        <w:pStyle w:val="CodeText"/>
+      </w:pPr>
+      <w:r>
+        <w:rPr>
+          <w:rFonts w:ascii="Consolas" w:hAnsi="Consolas" w:eastAsia="Consolas" w:cs="Consolas"/>
+          <w:sz w:val="17"/>
+        </w:rPr>
+        <w:t xml:space="preserve">            if row.get("city", "").strip().casefold() != CITY.casefold():</w:t>
+      </w:r>
+    </w:p>
+    <w:p>
+      <w:pPr>
+        <w:pStyle w:val="CodeText"/>
+      </w:pPr>
+      <w:r>
+        <w:rPr>
+          <w:rFonts w:ascii="Consolas" w:hAnsi="Consolas" w:eastAsia="Consolas" w:cs="Consolas"/>
+          <w:sz w:val="17"/>
+        </w:rPr>
+        <w:t xml:space="preserve">                continue</w:t>
+      </w:r>
+    </w:p>
+    <w:p>
+      <w:pPr>
+        <w:pStyle w:val="CodeText"/>
+      </w:pPr>
+      <w:r>
+        <w:rPr>
+          <w:rFonts w:ascii="Consolas" w:hAnsi="Consolas" w:eastAsia="Consolas" w:cs="Consolas"/>
+          <w:sz w:val="17"/>
+        </w:rPr>
+        <w:t xml:space="preserve">            if not url or url in seen or not any(word in text for word in TOPICS):</w:t>
+      </w:r>
+    </w:p>
+    <w:p>
+      <w:pPr>
+        <w:pStyle w:val="CodeText"/>
+      </w:pPr>
+      <w:r>
+        <w:rPr>
+          <w:rFonts w:ascii="Consolas" w:hAnsi="Consolas" w:eastAsia="Consolas" w:cs="Consolas"/>
+          <w:sz w:val="17"/>
+        </w:rPr>
+        <w:t xml:space="preserve">                continue</w:t>
+      </w:r>
+    </w:p>
+    <w:p>
+      <w:pPr>
+        <w:pStyle w:val="CodeText"/>
+      </w:pPr>
+      <w:r>
+        <w:rPr>
+          <w:rFonts w:ascii="Consolas" w:hAnsi="Consolas" w:eastAsia="Consolas" w:cs="Consolas"/>
+          <w:sz w:val="17"/>
+        </w:rPr>
+        <w:t xml:space="preserve">            seen.add(url)</w:t>
+      </w:r>
+    </w:p>
+    <w:p>
+      <w:pPr>
+        <w:pStyle w:val="CodeText"/>
+      </w:pPr>
+      <w:r>
+        <w:rPr>
+          <w:rFonts w:ascii="Consolas" w:hAnsi="Consolas" w:eastAsia="Consolas" w:cs="Consolas"/>
+          <w:sz w:val="17"/>
+        </w:rPr>
+        <w:t xml:space="preserve">            writer.writerow({key: row.get(key, "") for key in fields})</w:t>
+      </w:r>
+    </w:p>
+    <w:p>
+      <w:r>
+        <w:rPr>
+          <w:rFonts w:ascii="Arial" w:hAnsi="Arial" w:eastAsia="Arial" w:cs="Arial"/>
+          <w:b w:val="0"/>
+          <w:i w:val="0"/>
+        </w:rPr>
+        <w:t xml:space="preserve">Сохраните код как </w:t>
+      </w:r>
+      <w:r>
+        <w:rPr>
+          <w:rFonts w:ascii="Consolas" w:hAnsi="Consolas" w:eastAsia="Consolas" w:cs="Consolas"/>
+          <w:color w:val="333333"/>
+          <w:sz w:val="18"/>
+        </w:rPr>
+        <w:t>select_groups.py</w:t>
+      </w:r>
+      <w:r>
+        <w:rPr>
+          <w:rFonts w:ascii="Arial" w:hAnsi="Arial" w:eastAsia="Arial" w:cs="Arial"/>
+          <w:b w:val="0"/>
+          <w:i w:val="0"/>
+        </w:rPr>
+        <w:t xml:space="preserve">, положите рядом </w:t>
+      </w:r>
+      <w:r>
+        <w:rPr>
+          <w:rFonts w:ascii="Consolas" w:hAnsi="Consolas" w:eastAsia="Consolas" w:cs="Consolas"/>
+          <w:color w:val="333333"/>
+          <w:sz w:val="18"/>
+        </w:rPr>
+        <w:t>groups.csv</w:t>
+      </w:r>
+      <w:r>
+        <w:rPr>
+          <w:rFonts w:ascii="Arial" w:hAnsi="Arial" w:eastAsia="Arial" w:cs="Arial"/>
+          <w:b w:val="0"/>
+          <w:i w:val="0"/>
+        </w:rPr>
+        <w:t xml:space="preserve"> и запустите </w:t>
+      </w:r>
+      <w:r>
+        <w:rPr>
+          <w:rFonts w:ascii="Consolas" w:hAnsi="Consolas" w:eastAsia="Consolas" w:cs="Consolas"/>
+          <w:color w:val="333333"/>
+          <w:sz w:val="18"/>
+        </w:rPr>
+        <w:t>python select_groups.py</w:t>
+      </w:r>
+      <w:r>
+        <w:rPr>
+          <w:rFonts w:ascii="Arial" w:hAnsi="Arial" w:eastAsia="Arial" w:cs="Arial"/>
+          <w:b w:val="0"/>
+          <w:i w:val="0"/>
+        </w:rPr>
+        <w:t xml:space="preserve">. Результат — </w:t>
+      </w:r>
+      <w:r>
+        <w:rPr>
+          <w:rFonts w:ascii="Consolas" w:hAnsi="Consolas" w:eastAsia="Consolas" w:cs="Consolas"/>
+          <w:color w:val="333333"/>
+          <w:sz w:val="18"/>
+        </w:rPr>
+        <w:t>groups_shortlist.csv</w:t>
+      </w:r>
+      <w:r>
+        <w:rPr>
+          <w:rFonts w:ascii="Arial" w:hAnsi="Arial" w:eastAsia="Arial" w:cs="Arial"/>
+          <w:b w:val="0"/>
+          <w:i w:val="0"/>
+        </w:rPr>
+        <w:t>.</w:t>
+      </w:r>
+    </w:p>
+    <w:p>
+      <w:pPr>
+        <w:pStyle w:val="Heading3"/>
+      </w:pPr>
+      <w:r>
+        <w:t>Рабочий порядок инструментов</w:t>
+      </w:r>
+    </w:p>
+    <w:p>
+      <w:r>
+        <w:rPr>
+          <w:rFonts w:ascii="Arial" w:hAnsi="Arial" w:eastAsia="Arial" w:cs="Arial"/>
+          <w:b w:val="0"/>
+          <w:i w:val="0"/>
+        </w:rPr>
+        <w:t>Начинайте с первых пунктов и подключайте следующие, когда предыдущие уже оформлены и поддерживаются. Порядок учитывает доступность и ожидаемую пользу на старте. Реальную эффективность проверяйте по обращениям и посещениям в своём городе.</w:t>
+      </w:r>
+    </w:p>
+    <w:p>
+      <w:pPr>
+        <w:pStyle w:val="BulletText"/>
+      </w:pPr>
+      <w:r>
+        <w:rPr>
+          <w:rFonts w:ascii="Arial" w:hAnsi="Arial" w:eastAsia="Arial" w:cs="Arial"/>
+          <w:b w:val="0"/>
+          <w:i w:val="0"/>
+        </w:rPr>
+        <w:t xml:space="preserve">• </w:t>
+      </w:r>
+      <w:r>
+        <w:rPr>
+          <w:rFonts w:ascii="Arial" w:hAnsi="Arial" w:eastAsia="Arial" w:cs="Arial"/>
+          <w:b/>
+          <w:i w:val="0"/>
+        </w:rPr>
+        <w:t>1. Avito</w:t>
+      </w:r>
+      <w:r>
+        <w:rPr>
+          <w:rFonts w:ascii="Arial" w:hAnsi="Arial" w:eastAsia="Arial" w:cs="Arial"/>
+          <w:b w:val="0"/>
+          <w:i w:val="0"/>
+        </w:rPr>
+        <w:t xml:space="preserve"> быстрый старт</w:t>
+      </w:r>
+    </w:p>
+    <w:p>
+      <w:r>
+        <w:rPr>
+          <w:rFonts w:ascii="Arial" w:hAnsi="Arial" w:eastAsia="Arial" w:cs="Arial"/>
+          <w:b w:val="0"/>
+          <w:i w:val="0"/>
+        </w:rPr>
+        <w:t>Городское объявление с понятным предложением и прямым способом написать.</w:t>
+      </w:r>
+    </w:p>
+    <w:p>
+      <w:hyperlink r:id="rId15">
+        <w:r>
+          <w:rPr>
+            <w:color w:val="1F5E4A"/>
+            <w:u w:val="single"/>
+            <w:rFonts w:ascii="Arial" w:hAnsi="Arial" w:eastAsia="Arial" w:cs="Arial"/>
+          </w:rPr>
+          <w:t>Инструкция и промпт</w:t>
+        </w:r>
+      </w:hyperlink>
+    </w:p>
+    <w:p>
+      <w:pPr>
+        <w:pStyle w:val="BulletText"/>
+      </w:pPr>
+      <w:r>
+        <w:rPr>
+          <w:rFonts w:ascii="Arial" w:hAnsi="Arial" w:eastAsia="Arial" w:cs="Arial"/>
+          <w:b w:val="0"/>
+          <w:i w:val="0"/>
+        </w:rPr>
+        <w:t xml:space="preserve">• </w:t>
+      </w:r>
+      <w:r>
+        <w:rPr>
+          <w:rFonts w:ascii="Arial" w:hAnsi="Arial" w:eastAsia="Arial" w:cs="Arial"/>
+          <w:b/>
+          <w:i w:val="0"/>
+        </w:rPr>
         <w:t>2. Личный бренд</w:t>
       </w:r>
     </w:p>
@@ -1006,7 +2491,7 @@
       </w:r>
     </w:p>
     <w:p>
-      <w:hyperlink r:id="rId15">
+      <w:hyperlink r:id="rId19">
         <w:r>
           <w:rPr>
             <w:color w:val="1F5E4A"/>
@@ -1049,7 +2534,7 @@
       </w:r>
     </w:p>
     <w:p>
-      <w:hyperlink r:id="rId12">
+      <w:hyperlink r:id="rId14">
         <w:r>
           <w:rPr>
             <w:color w:val="1F5E4A"/>
@@ -1092,7 +2577,7 @@
       </w:r>
     </w:p>
     <w:p>
-      <w:hyperlink r:id="rId16">
+      <w:hyperlink r:id="rId18">
         <w:r>
           <w:rPr>
             <w:color w:val="1F5E4A"/>
@@ -1143,7 +2628,7 @@
       </w:r>
     </w:p>
     <w:p>
-      <w:hyperlink r:id="rId17">
+      <w:hyperlink r:id="rId21">
         <w:r>
           <w:rPr>
             <w:color w:val="1F5E4A"/>
@@ -1186,7 +2671,7 @@
       </w:r>
     </w:p>
     <w:p>
-      <w:hyperlink r:id="rId18">
+      <w:hyperlink r:id="rId22">
         <w:r>
           <w:rPr>
             <w:color w:val="1F5E4A"/>
@@ -1224,7 +2709,7 @@
       </w:r>
     </w:p>
     <w:p>
-      <w:hyperlink r:id="rId19">
+      <w:hyperlink r:id="rId23">
         <w:r>
           <w:rPr>
             <w:color w:val="1F5E4A"/>
@@ -1236,7 +2721,7 @@
       </w:hyperlink>
     </w:p>
     <w:p>
-      <w:hyperlink r:id="rId20">
+      <w:hyperlink r:id="rId24">
         <w:r>
           <w:rPr>
             <w:color w:val="1F5E4A"/>
@@ -2172,7 +3657,7 @@
       </w:r>
     </w:p>
     <w:p>
-      <w:hyperlink r:id="rId21">
+      <w:hyperlink r:id="rId25">
         <w:r>
           <w:rPr>
             <w:color w:val="1F5E4A"/>
@@ -2553,7 +4038,7 @@
       </w:r>
     </w:p>
     <w:p>
-      <w:hyperlink r:id="rId22">
+      <w:hyperlink r:id="rId26">
         <w:r>
           <w:rPr>
             <w:color w:val="1F5E4A"/>
@@ -2602,7 +4087,7 @@
         </w:rPr>
         <w:t xml:space="preserve">• </w:t>
       </w:r>
-      <w:hyperlink r:id="rId23">
+      <w:hyperlink r:id="rId27">
         <w:r>
           <w:rPr>
             <w:color w:val="1F5E4A"/>
@@ -2625,7 +4110,7 @@
         </w:rPr>
         <w:t xml:space="preserve">• </w:t>
       </w:r>
-      <w:hyperlink r:id="rId24">
+      <w:hyperlink r:id="rId28">
         <w:r>
           <w:rPr>
             <w:color w:val="1F5E4A"/>
@@ -2648,7 +4133,7 @@
         </w:rPr>
         <w:t xml:space="preserve">• </w:t>
       </w:r>
-      <w:hyperlink r:id="rId25">
+      <w:hyperlink r:id="rId29">
         <w:r>
           <w:rPr>
             <w:color w:val="1F5E4A"/>
@@ -2660,7 +4145,7 @@
       </w:hyperlink>
     </w:p>
     <w:p>
-      <w:hyperlink r:id="rId26">
+      <w:hyperlink r:id="rId30">
         <w:r>
           <w:rPr>
             <w:color w:val="1F5E4A"/>
@@ -2675,7 +4160,7 @@
       <w:pPr>
         <w:spacing w:before="120"/>
       </w:pPr>
-      <w:hyperlink r:id="rId27">
+      <w:hyperlink r:id="rId31">
         <w:r>
           <w:rPr>
             <w:color w:val="1F5E4A"/>
@@ -2709,6 +4194,24 @@
           <w:b w:val="0"/>
           <w:i w:val="0"/>
         </w:rPr>
+        <w:t>Создавайте встречи, после которых хочется практиковать и вернуться.</w:t>
+      </w:r>
+    </w:p>
+    <w:p>
+      <w:pPr>
+        <w:pStyle w:val="Heading4"/>
+      </w:pPr>
+      <w:r>
+        <w:t>Смысл направления</w:t>
+      </w:r>
+    </w:p>
+    <w:p>
+      <w:r>
+        <w:rPr>
+          <w:rFonts w:ascii="Arial" w:hAnsi="Arial" w:eastAsia="Arial" w:cs="Arial"/>
+          <w:b w:val="0"/>
+          <w:i w:val="0"/>
+        </w:rPr>
         <w:t>Создать полезную, хорошо организованную и живую встречу, на которой человек получает опыт практики, может общаться и чувствует атмосферу сообщества йоги и медитации.</w:t>
       </w:r>
     </w:p>
@@ -2735,6 +4238,156 @@
         <w:pStyle w:val="Heading3"/>
       </w:pPr>
       <w:r>
+        <w:t>Регулярные задачи</w:t>
+      </w:r>
+    </w:p>
+    <w:p>
+      <w:pPr>
+        <w:pStyle w:val="BulletText"/>
+      </w:pPr>
+      <w:r>
+        <w:rPr>
+          <w:rFonts w:ascii="Arial" w:hAnsi="Arial" w:eastAsia="Arial" w:cs="Arial"/>
+          <w:b w:val="0"/>
+          <w:i w:val="0"/>
+        </w:rPr>
+        <w:t xml:space="preserve">• </w:t>
+      </w:r>
+      <w:hyperlink r:id="rId32">
+        <w:r>
+          <w:rPr>
+            <w:color w:val="1F5E4A"/>
+            <w:u w:val="single"/>
+            <w:rFonts w:ascii="Arial" w:hAnsi="Arial" w:eastAsia="Arial" w:cs="Arial"/>
+          </w:rPr>
+          <w:t>КМ · неделя</w:t>
+        </w:r>
+      </w:hyperlink>
+    </w:p>
+    <w:p>
+      <w:pPr>
+        <w:pStyle w:val="BulletText"/>
+      </w:pPr>
+      <w:r>
+        <w:rPr>
+          <w:rFonts w:ascii="Arial" w:hAnsi="Arial" w:eastAsia="Arial" w:cs="Arial"/>
+          <w:b w:val="0"/>
+          <w:i w:val="0"/>
+        </w:rPr>
+        <w:t xml:space="preserve">• </w:t>
+      </w:r>
+      <w:hyperlink r:id="rId33">
+        <w:r>
+          <w:rPr>
+            <w:color w:val="1F5E4A"/>
+            <w:u w:val="single"/>
+            <w:rFonts w:ascii="Arial" w:hAnsi="Arial" w:eastAsia="Arial" w:cs="Arial"/>
+          </w:rPr>
+          <w:t>Забота на встрече</w:t>
+        </w:r>
+      </w:hyperlink>
+    </w:p>
+    <w:p>
+      <w:pPr>
+        <w:pStyle w:val="BulletText"/>
+      </w:pPr>
+      <w:r>
+        <w:rPr>
+          <w:rFonts w:ascii="Arial" w:hAnsi="Arial" w:eastAsia="Arial" w:cs="Arial"/>
+          <w:b w:val="0"/>
+          <w:i w:val="0"/>
+        </w:rPr>
+        <w:t xml:space="preserve">• </w:t>
+      </w:r>
+      <w:hyperlink r:id="rId34">
+        <w:r>
+          <w:rPr>
+            <w:color w:val="1F5E4A"/>
+            <w:u w:val="single"/>
+            <w:rFonts w:ascii="Arial" w:hAnsi="Arial" w:eastAsia="Arial" w:cs="Arial"/>
+          </w:rPr>
+          <w:t>Формат · месяц</w:t>
+        </w:r>
+      </w:hyperlink>
+    </w:p>
+    <w:p>
+      <w:pPr>
+        <w:pStyle w:val="Heading4"/>
+      </w:pPr>
+      <w:r>
+        <w:t>Обязательный минимум</w:t>
+      </w:r>
+    </w:p>
+    <w:p>
+      <w:pPr>
+        <w:pStyle w:val="ChecklistText"/>
+      </w:pPr>
+      <w:r>
+        <w:rPr>
+          <w:rFonts w:ascii="Arial" w:hAnsi="Arial" w:eastAsia="Arial" w:cs="Arial"/>
+          <w:b w:val="0"/>
+          <w:i w:val="0"/>
+        </w:rPr>
+        <w:t>☐ Еженедельная коллективная медитация (КМ): понятные место, время и ведущий.</w:t>
+      </w:r>
+    </w:p>
+    <w:p>
+      <w:pPr>
+        <w:pStyle w:val="ChecklistText"/>
+      </w:pPr>
+      <w:r>
+        <w:rPr>
+          <w:rFonts w:ascii="Arial" w:hAnsi="Arial" w:eastAsia="Arial" w:cs="Arial"/>
+          <w:b w:val="0"/>
+          <w:i w:val="0"/>
+        </w:rPr>
+        <w:t>☐ Сценарий встречи, подготовленное пространство и распределённые роли.</w:t>
+      </w:r>
+    </w:p>
+    <w:p>
+      <w:pPr>
+        <w:pStyle w:val="ChecklistText"/>
+      </w:pPr>
+      <w:r>
+        <w:rPr>
+          <w:rFonts w:ascii="Arial" w:hAnsi="Arial" w:eastAsia="Arial" w:cs="Arial"/>
+          <w:b w:val="0"/>
+          <w:i w:val="0"/>
+        </w:rPr>
+        <w:t>☐ Забота о новичках, возможность высказаться и пообщаться.</w:t>
+      </w:r>
+    </w:p>
+    <w:p>
+      <w:pPr>
+        <w:pStyle w:val="ChecklistText"/>
+      </w:pPr>
+      <w:r>
+        <w:rPr>
+          <w:rFonts w:ascii="Arial" w:hAnsi="Arial" w:eastAsia="Arial" w:cs="Arial"/>
+          <w:b w:val="0"/>
+          <w:i w:val="0"/>
+        </w:rPr>
+        <w:t>☐ Понятное продолжение и передача договорённостей заботнику.</w:t>
+      </w:r>
+    </w:p>
+    <w:p>
+      <w:pPr>
+        <w:pStyle w:val="ChecklistText"/>
+      </w:pPr>
+      <w:r>
+        <w:rPr>
+          <w:rFonts w:ascii="Arial" w:hAnsi="Arial" w:eastAsia="Arial" w:cs="Arial"/>
+          <w:b w:val="0"/>
+          <w:i w:val="0"/>
+        </w:rPr>
+        <w:t>☐ Одна дополнительная программа в месяц: например, кино с обсуждением или поход.</w:t>
+      </w:r>
+    </w:p>
+    <w:p>
+      <w:pPr>
+        <w:pStyle w:val="Heading3"/>
+      </w:pPr>
+      <w:r>
         <w:t>Сделать сначала</w:t>
       </w:r>
     </w:p>
@@ -2768,7 +4421,7 @@
         </w:rPr>
         <w:t xml:space="preserve">1. Выберите один формат и сформулируйте пользу для новичка. </w:t>
       </w:r>
-      <w:hyperlink r:id="rId28">
+      <w:hyperlink r:id="rId35">
         <w:r>
           <w:rPr>
             <w:color w:val="1F5E4A"/>
@@ -2791,7 +4444,7 @@
         </w:rPr>
         <w:t xml:space="preserve">2. Определите ведущего, место, дату, длительность и условия участия. </w:t>
       </w:r>
-      <w:hyperlink r:id="rId29">
+      <w:hyperlink r:id="rId36">
         <w:r>
           <w:rPr>
             <w:color w:val="1F5E4A"/>
@@ -2814,7 +4467,7 @@
         </w:rPr>
         <w:t xml:space="preserve">3. Запишите сценарий: встреча гостей → объяснение → практика → вопросы и общение → следующий шаг. Назначьте ответственных. </w:t>
       </w:r>
-      <w:hyperlink r:id="rId30">
+      <w:hyperlink r:id="rId33">
         <w:r>
           <w:rPr>
             <w:color w:val="1F5E4A"/>
@@ -2837,7 +4490,7 @@
         </w:rPr>
         <w:t xml:space="preserve">4. Проведите встречу, соберите впечатления и передайте договорённости заботнику. </w:t>
       </w:r>
-      <w:hyperlink r:id="rId31">
+      <w:hyperlink r:id="rId37">
         <w:r>
           <w:rPr>
             <w:color w:val="1F5E4A"/>
@@ -2871,7 +4524,7 @@
           <w:b w:val="0"/>
           <w:i w:val="0"/>
         </w:rPr>
-        <w:t>Повторяйте выбранный формат в понятном ритме. Перед каждой встречей проверяйте сценарий и пространство; после — разбирайте, что помогло участникам и что затруднило участие.</w:t>
+        <w:t>Проводите коллективную медитацию каждую неделю. Перед каждой встречей проверяйте сценарий и пространство; после — разбирайте, что помогло участникам и что затруднило участие.</w:t>
       </w:r>
     </w:p>
     <w:p>
@@ -2907,7 +4560,25 @@
           <w:b w:val="0"/>
           <w:i w:val="0"/>
         </w:rPr>
-        <w:t>Улучшайте одну часть за раз: встречу новичков, практическую пользу, общение или завершение. Добавляйте новый формат, когда текущий можно уверенно повторить. Детальные стандарты наполним по ответам команды.</w:t>
+        <w:t xml:space="preserve">Каждый месяц добавляйте одну программу помимо еженедельной коллективной медитации: например, кино с обсуждением, поход или тематическую встречу. Выбирайте формат по интересам людей и возможностям команды. </w:t>
+      </w:r>
+      <w:hyperlink r:id="rId34">
+        <w:r>
+          <w:rPr>
+            <w:color w:val="1F5E4A"/>
+            <w:u w:val="single"/>
+            <w:rFonts w:ascii="Arial" w:hAnsi="Arial" w:eastAsia="Arial" w:cs="Arial"/>
+          </w:rPr>
+          <w:t>Открыть план программы месяца</w:t>
+        </w:r>
+      </w:hyperlink>
+      <w:r>
+        <w:rPr>
+          <w:rFonts w:ascii="Arial" w:hAnsi="Arial" w:eastAsia="Arial" w:cs="Arial"/>
+          <w:b w:val="0"/>
+          <w:i w:val="0"/>
+        </w:rPr>
+        <w:t>. Детальные стандарты наполним по ответам команды.</w:t>
       </w:r>
     </w:p>
     <w:p>
@@ -2925,6 +4596,339 @@
         <w:pStyle w:val="Heading3"/>
       </w:pPr>
       <w:r>
+        <w:t>Ритм программ и развитие месяца</w:t>
+      </w:r>
+    </w:p>
+    <w:p>
+      <w:r>
+        <w:rPr>
+          <w:rFonts w:ascii="Arial" w:hAnsi="Arial" w:eastAsia="Arial" w:cs="Arial"/>
+          <w:b/>
+          <w:i w:val="0"/>
+        </w:rPr>
+        <w:t>Каждую неделю — коллективная медитация (КМ).</w:t>
+      </w:r>
+      <w:r>
+        <w:rPr>
+          <w:rFonts w:ascii="Arial" w:hAnsi="Arial" w:eastAsia="Arial" w:cs="Arial"/>
+          <w:b w:val="0"/>
+          <w:i w:val="0"/>
+        </w:rPr>
+        <w:t xml:space="preserve"> Участники знают постоянный ритм, а команда поддерживает качество встречи, заботу и следующий шаг. </w:t>
+      </w:r>
+      <w:hyperlink r:id="rId38">
+        <w:r>
+          <w:rPr>
+            <w:color w:val="1F5E4A"/>
+            <w:u w:val="single"/>
+            <w:rFonts w:ascii="Arial" w:hAnsi="Arial" w:eastAsia="Arial" w:cs="Arial"/>
+          </w:rPr>
+          <w:t>Стандарт коллективной практики</w:t>
+        </w:r>
+      </w:hyperlink>
+      <w:r>
+        <w:rPr>
+          <w:rFonts w:ascii="Arial" w:hAnsi="Arial" w:eastAsia="Arial" w:cs="Arial"/>
+          <w:b w:val="0"/>
+          <w:i w:val="0"/>
+        </w:rPr>
+        <w:t>.</w:t>
+      </w:r>
+    </w:p>
+    <w:p>
+      <w:pPr>
+        <w:pStyle w:val="Heading4"/>
+      </w:pPr>
+      <w:r>
+        <w:t>Каждый месяц — дополнительная программа</w:t>
+      </w:r>
+    </w:p>
+    <w:p>
+      <w:r>
+        <w:rPr>
+          <w:rFonts w:ascii="Arial" w:hAnsi="Arial" w:eastAsia="Arial" w:cs="Arial"/>
+          <w:b/>
+          <w:i w:val="0"/>
+        </w:rPr>
+        <w:t>Задача:</w:t>
+      </w:r>
+      <w:r>
+        <w:rPr>
+          <w:rFonts w:ascii="Arial" w:hAnsi="Arial" w:eastAsia="Arial" w:cs="Arial"/>
+          <w:b w:val="0"/>
+          <w:i w:val="0"/>
+        </w:rPr>
+        <w:t xml:space="preserve"> дать людям новый полезный опыт, укрепить общение и желание возвращаться. Ежемесячная программа дополняет регулярную КМ.</w:t>
+      </w:r>
+    </w:p>
+    <w:p>
+      <w:pPr>
+        <w:pStyle w:val="BulletText"/>
+      </w:pPr>
+      <w:r>
+        <w:rPr>
+          <w:rFonts w:ascii="Arial" w:hAnsi="Arial" w:eastAsia="Arial" w:cs="Arial"/>
+          <w:b w:val="0"/>
+          <w:i w:val="0"/>
+        </w:rPr>
+        <w:t>1. Спросите участников, что им интересно; используйте опрос в общем чате.</w:t>
+      </w:r>
+    </w:p>
+    <w:p>
+      <w:pPr>
+        <w:pStyle w:val="BulletText"/>
+      </w:pPr>
+      <w:r>
+        <w:rPr>
+          <w:rFonts w:ascii="Arial" w:hAnsi="Arial" w:eastAsia="Arial" w:cs="Arial"/>
+          <w:b w:val="0"/>
+          <w:i w:val="0"/>
+        </w:rPr>
+        <w:t>2. Выберите один формат и пользу для человека. Например, просмотр фильма с обсуждением, поход или тематическую встречу.</w:t>
+      </w:r>
+    </w:p>
+    <w:p>
+      <w:pPr>
+        <w:pStyle w:val="BulletText"/>
+      </w:pPr>
+      <w:r>
+        <w:rPr>
+          <w:rFonts w:ascii="Arial" w:hAnsi="Arial" w:eastAsia="Arial" w:cs="Arial"/>
+          <w:b w:val="0"/>
+          <w:i w:val="0"/>
+        </w:rPr>
+        <w:t>3. Согласуйте дату, ведущего или организатора, место, условия и ответственных.</w:t>
+      </w:r>
+    </w:p>
+    <w:p>
+      <w:pPr>
+        <w:pStyle w:val="BulletText"/>
+      </w:pPr>
+      <w:r>
+        <w:rPr>
+          <w:rFonts w:ascii="Arial" w:hAnsi="Arial" w:eastAsia="Arial" w:cs="Arial"/>
+          <w:b w:val="0"/>
+          <w:i w:val="0"/>
+        </w:rPr>
+        <w:t xml:space="preserve">4. Подготовьте </w:t>
+      </w:r>
+      <w:hyperlink r:id="rId36">
+        <w:r>
+          <w:rPr>
+            <w:color w:val="1F5E4A"/>
+            <w:u w:val="single"/>
+            <w:rFonts w:ascii="Arial" w:hAnsi="Arial" w:eastAsia="Arial" w:cs="Arial"/>
+          </w:rPr>
+          <w:t>сценарий</w:t>
+        </w:r>
+      </w:hyperlink>
+      <w:r>
+        <w:rPr>
+          <w:rFonts w:ascii="Arial" w:hAnsi="Arial" w:eastAsia="Arial" w:cs="Arial"/>
+          <w:b w:val="0"/>
+          <w:i w:val="0"/>
+        </w:rPr>
+        <w:t xml:space="preserve">, </w:t>
+      </w:r>
+      <w:hyperlink r:id="rId39">
+        <w:r>
+          <w:rPr>
+            <w:color w:val="1F5E4A"/>
+            <w:u w:val="single"/>
+            <w:rFonts w:ascii="Arial" w:hAnsi="Arial" w:eastAsia="Arial" w:cs="Arial"/>
+          </w:rPr>
+          <w:t>анонс</w:t>
+        </w:r>
+      </w:hyperlink>
+      <w:r>
+        <w:rPr>
+          <w:rFonts w:ascii="Arial" w:hAnsi="Arial" w:eastAsia="Arial" w:cs="Arial"/>
+          <w:b w:val="0"/>
+          <w:i w:val="0"/>
+        </w:rPr>
+        <w:t xml:space="preserve"> и </w:t>
+      </w:r>
+      <w:hyperlink r:id="rId33">
+        <w:r>
+          <w:rPr>
+            <w:color w:val="1F5E4A"/>
+            <w:u w:val="single"/>
+            <w:rFonts w:ascii="Arial" w:hAnsi="Arial" w:eastAsia="Arial" w:cs="Arial"/>
+          </w:rPr>
+          <w:t>заботу на встрече</w:t>
+        </w:r>
+      </w:hyperlink>
+      <w:r>
+        <w:rPr>
+          <w:rFonts w:ascii="Arial" w:hAnsi="Arial" w:eastAsia="Arial" w:cs="Arial"/>
+          <w:b w:val="0"/>
+          <w:i w:val="0"/>
+        </w:rPr>
+        <w:t>.</w:t>
+      </w:r>
+    </w:p>
+    <w:p>
+      <w:pPr>
+        <w:pStyle w:val="BulletText"/>
+      </w:pPr>
+      <w:r>
+        <w:rPr>
+          <w:rFonts w:ascii="Arial" w:hAnsi="Arial" w:eastAsia="Arial" w:cs="Arial"/>
+          <w:b w:val="0"/>
+          <w:i w:val="0"/>
+        </w:rPr>
+        <w:t>5. Проведите программу, дайте возможность общаться и предложите понятное продолжение.</w:t>
+      </w:r>
+    </w:p>
+    <w:p>
+      <w:pPr>
+        <w:pStyle w:val="BulletText"/>
+      </w:pPr>
+      <w:r>
+        <w:rPr>
+          <w:rFonts w:ascii="Arial" w:hAnsi="Arial" w:eastAsia="Arial" w:cs="Arial"/>
+          <w:b w:val="0"/>
+          <w:i w:val="0"/>
+        </w:rPr>
+        <w:t>6. Соберите впечатления и решите, что сохранить или улучшить в следующем месяце.</w:t>
+      </w:r>
+    </w:p>
+    <w:p>
+      <w:pPr>
+        <w:pStyle w:val="Heading4"/>
+      </w:pPr>
+      <w:r>
+        <w:t>Примеры форматов — заготовки для команды</w:t>
+      </w:r>
+    </w:p>
+    <w:p>
+      <w:pPr>
+        <w:pStyle w:val="BulletText"/>
+      </w:pPr>
+      <w:r>
+        <w:rPr>
+          <w:rFonts w:ascii="Arial" w:hAnsi="Arial" w:eastAsia="Arial" w:cs="Arial"/>
+          <w:b w:val="0"/>
+          <w:i w:val="0"/>
+        </w:rPr>
+        <w:t xml:space="preserve">• </w:t>
+      </w:r>
+      <w:r>
+        <w:rPr>
+          <w:rFonts w:ascii="Arial" w:hAnsi="Arial" w:eastAsia="Arial" w:cs="Arial"/>
+          <w:b/>
+          <w:i w:val="0"/>
+        </w:rPr>
+        <w:t>Кино с обсуждением:</w:t>
+      </w:r>
+      <w:r>
+        <w:rPr>
+          <w:rFonts w:ascii="Arial" w:hAnsi="Arial" w:eastAsia="Arial" w:cs="Arial"/>
+          <w:b w:val="0"/>
+          <w:i w:val="0"/>
+        </w:rPr>
+        <w:t xml:space="preserve"> выбрать подходящий фильм и тему; проверить условия показа; после просмотра дать каждому возможность высказаться.</w:t>
+      </w:r>
+    </w:p>
+    <w:p>
+      <w:pPr>
+        <w:pStyle w:val="BulletText"/>
+      </w:pPr>
+      <w:r>
+        <w:rPr>
+          <w:rFonts w:ascii="Arial" w:hAnsi="Arial" w:eastAsia="Arial" w:cs="Arial"/>
+          <w:b w:val="0"/>
+          <w:i w:val="0"/>
+        </w:rPr>
+        <w:t xml:space="preserve">• </w:t>
+      </w:r>
+      <w:r>
+        <w:rPr>
+          <w:rFonts w:ascii="Arial" w:hAnsi="Arial" w:eastAsia="Arial" w:cs="Arial"/>
+          <w:b/>
+          <w:i w:val="0"/>
+        </w:rPr>
+        <w:t>Поход или прогулка:</w:t>
+      </w:r>
+      <w:r>
+        <w:rPr>
+          <w:rFonts w:ascii="Arial" w:hAnsi="Arial" w:eastAsia="Arial" w:cs="Arial"/>
+          <w:b w:val="0"/>
+          <w:i w:val="0"/>
+        </w:rPr>
+        <w:t xml:space="preserve"> выбрать маршрут и сложность, объяснить подготовку, назначить организатора и оставить время для общения.</w:t>
+      </w:r>
+    </w:p>
+    <w:p>
+      <w:pPr>
+        <w:pStyle w:val="BulletText"/>
+      </w:pPr>
+      <w:r>
+        <w:rPr>
+          <w:rFonts w:ascii="Arial" w:hAnsi="Arial" w:eastAsia="Arial" w:cs="Arial"/>
+          <w:b w:val="0"/>
+          <w:i w:val="0"/>
+        </w:rPr>
+        <w:t xml:space="preserve">• </w:t>
+      </w:r>
+      <w:r>
+        <w:rPr>
+          <w:rFonts w:ascii="Arial" w:hAnsi="Arial" w:eastAsia="Arial" w:cs="Arial"/>
+          <w:b/>
+          <w:i w:val="0"/>
+        </w:rPr>
+        <w:t>Тематическая встреча:</w:t>
+      </w:r>
+      <w:r>
+        <w:rPr>
+          <w:rFonts w:ascii="Arial" w:hAnsi="Arial" w:eastAsia="Arial" w:cs="Arial"/>
+          <w:b w:val="0"/>
+          <w:i w:val="0"/>
+        </w:rPr>
+        <w:t xml:space="preserve"> взять живой вопрос участников, добавить практическую часть, вопросы и общение.</w:t>
+      </w:r>
+    </w:p>
+    <w:p>
+      <w:r>
+        <w:rPr>
+          <w:rFonts w:ascii="Arial" w:hAnsi="Arial" w:eastAsia="Arial" w:cs="Arial"/>
+          <w:b w:val="0"/>
+          <w:i w:val="0"/>
+        </w:rPr>
+        <w:t>Это примеры, а не утверждённые сценарии. Выбирайте формат по интересам людей и возможностям юнита.</w:t>
+      </w:r>
+    </w:p>
+    <w:p>
+      <w:r>
+        <w:rPr>
+          <w:rFonts w:ascii="Arial" w:hAnsi="Arial" w:eastAsia="Arial" w:cs="Arial"/>
+          <w:b w:val="0"/>
+          <w:i w:val="0"/>
+        </w:rPr>
+        <w:t xml:space="preserve">Короткий план месяца: </w:t>
+      </w:r>
+      <w:r>
+        <w:rPr>
+          <w:rFonts w:ascii="Arial" w:hAnsi="Arial" w:eastAsia="Arial" w:cs="Arial"/>
+          <w:b/>
+          <w:i w:val="0"/>
+        </w:rPr>
+        <w:t>формат → польза → дата → ответственный → анонс → сценарий → забота → впечатления → улучшение</w:t>
+      </w:r>
+      <w:r>
+        <w:rPr>
+          <w:rFonts w:ascii="Arial" w:hAnsi="Arial" w:eastAsia="Arial" w:cs="Arial"/>
+          <w:b w:val="0"/>
+          <w:i w:val="0"/>
+        </w:rPr>
+        <w:t>.</w:t>
+      </w:r>
+    </w:p>
+    <w:p>
+      <w:pPr>
+        <w:pStyle w:val="Heading3"/>
+      </w:pPr>
+      <w:r>
         <w:t>Что обязательно должна давать программа</w:t>
       </w:r>
     </w:p>
@@ -3803,7 +5807,7 @@
       </w:r>
     </w:p>
     <w:p>
-      <w:hyperlink r:id="rId25">
+      <w:hyperlink r:id="rId29">
         <w:r>
           <w:rPr>
             <w:color w:val="1F5E4A"/>
@@ -5237,7 +7241,7 @@
         </w:rPr>
         <w:t xml:space="preserve">• </w:t>
       </w:r>
-      <w:hyperlink r:id="rId32">
+      <w:hyperlink r:id="rId38">
         <w:r>
           <w:rPr>
             <w:color w:val="1F5E4A"/>
@@ -5260,7 +7264,7 @@
         </w:rPr>
         <w:t xml:space="preserve">• </w:t>
       </w:r>
-      <w:hyperlink r:id="rId33">
+      <w:hyperlink r:id="rId40">
         <w:r>
           <w:rPr>
             <w:color w:val="1F5E4A"/>
@@ -5283,7 +7287,7 @@
         </w:rPr>
         <w:t xml:space="preserve">• </w:t>
       </w:r>
-      <w:hyperlink r:id="rId34">
+      <w:hyperlink r:id="rId41">
         <w:r>
           <w:rPr>
             <w:color w:val="1F5E4A"/>
@@ -5295,7 +7299,7 @@
       </w:hyperlink>
     </w:p>
     <w:p>
-      <w:hyperlink r:id="rId26">
+      <w:hyperlink r:id="rId30">
         <w:r>
           <w:rPr>
             <w:color w:val="1F5E4A"/>
@@ -5310,7 +7314,7 @@
       <w:pPr>
         <w:spacing w:before="120"/>
       </w:pPr>
-      <w:hyperlink r:id="rId35">
+      <w:hyperlink r:id="rId42">
         <w:r>
           <w:rPr>
             <w:color w:val="1F5E4A"/>
@@ -5344,6 +7348,24 @@
           <w:b w:val="0"/>
           <w:i w:val="0"/>
         </w:rPr>
+        <w:t>Помогайте человеку чувствовать поддержку и двигаться к самостоятельной практике.</w:t>
+      </w:r>
+    </w:p>
+    <w:p>
+      <w:pPr>
+        <w:pStyle w:val="Heading4"/>
+      </w:pPr>
+      <w:r>
+        <w:t>Смысл направления</w:t>
+      </w:r>
+    </w:p>
+    <w:p>
+      <w:r>
+        <w:rPr>
+          <w:rFonts w:ascii="Arial" w:hAnsi="Arial" w:eastAsia="Arial" w:cs="Arial"/>
+          <w:b w:val="0"/>
+          <w:i w:val="0"/>
+        </w:rPr>
         <w:t>Помочь человеку пройти путь от первого контакта до регулярной самостоятельной практики, обучения и дальнейшего включения в сообщество.</w:t>
       </w:r>
     </w:p>
@@ -5370,6 +7392,210 @@
         <w:pStyle w:val="Heading3"/>
       </w:pPr>
       <w:r>
+        <w:t>Регулярные задачи</w:t>
+      </w:r>
+    </w:p>
+    <w:p>
+      <w:pPr>
+        <w:pStyle w:val="BulletText"/>
+      </w:pPr>
+      <w:r>
+        <w:rPr>
+          <w:rFonts w:ascii="Arial" w:hAnsi="Arial" w:eastAsia="Arial" w:cs="Arial"/>
+          <w:b w:val="0"/>
+          <w:i w:val="0"/>
+        </w:rPr>
+        <w:t xml:space="preserve">• </w:t>
+      </w:r>
+      <w:hyperlink r:id="rId43">
+        <w:r>
+          <w:rPr>
+            <w:color w:val="1F5E4A"/>
+            <w:u w:val="single"/>
+            <w:rFonts w:ascii="Arial" w:hAnsi="Arial" w:eastAsia="Arial" w:cs="Arial"/>
+          </w:rPr>
+          <w:t>Связь и учёт</w:t>
+        </w:r>
+      </w:hyperlink>
+    </w:p>
+    <w:p>
+      <w:pPr>
+        <w:pStyle w:val="BulletText"/>
+      </w:pPr>
+      <w:r>
+        <w:rPr>
+          <w:rFonts w:ascii="Arial" w:hAnsi="Arial" w:eastAsia="Arial" w:cs="Arial"/>
+          <w:b w:val="0"/>
+          <w:i w:val="0"/>
+        </w:rPr>
+        <w:t xml:space="preserve">• </w:t>
+      </w:r>
+      <w:hyperlink r:id="rId44">
+        <w:r>
+          <w:rPr>
+            <w:color w:val="1F5E4A"/>
+            <w:u w:val="single"/>
+            <w:rFonts w:ascii="Arial" w:hAnsi="Arial" w:eastAsia="Arial" w:cs="Arial"/>
+          </w:rPr>
+          <w:t>Живой чат</w:t>
+        </w:r>
+      </w:hyperlink>
+    </w:p>
+    <w:p>
+      <w:pPr>
+        <w:pStyle w:val="BulletText"/>
+      </w:pPr>
+      <w:r>
+        <w:rPr>
+          <w:rFonts w:ascii="Arial" w:hAnsi="Arial" w:eastAsia="Arial" w:cs="Arial"/>
+          <w:b w:val="0"/>
+          <w:i w:val="0"/>
+        </w:rPr>
+        <w:t xml:space="preserve">• </w:t>
+      </w:r>
+      <w:hyperlink r:id="rId45">
+        <w:r>
+          <w:rPr>
+            <w:color w:val="1F5E4A"/>
+            <w:u w:val="single"/>
+            <w:rFonts w:ascii="Arial" w:hAnsi="Arial" w:eastAsia="Arial" w:cs="Arial"/>
+          </w:rPr>
+          <w:t>Улучшение · месяц</w:t>
+        </w:r>
+      </w:hyperlink>
+    </w:p>
+    <w:p>
+      <w:pPr>
+        <w:pStyle w:val="Heading4"/>
+      </w:pPr>
+      <w:r>
+        <w:t>Обязательный минимум</w:t>
+      </w:r>
+    </w:p>
+    <w:p>
+      <w:pPr>
+        <w:pStyle w:val="ChecklistText"/>
+      </w:pPr>
+      <w:r>
+        <w:rPr>
+          <w:rFonts w:ascii="Arial" w:hAnsi="Arial" w:eastAsia="Arial" w:cs="Arial"/>
+          <w:b w:val="0"/>
+          <w:i w:val="0"/>
+        </w:rPr>
+        <w:t xml:space="preserve">☐ Назначенный заботник и </w:t>
+      </w:r>
+      <w:hyperlink r:id="rId43">
+        <w:r>
+          <w:rPr>
+            <w:color w:val="1F5E4A"/>
+            <w:u w:val="single"/>
+            <w:rFonts w:ascii="Arial" w:hAnsi="Arial" w:eastAsia="Arial" w:cs="Arial"/>
+          </w:rPr>
+          <w:t>приложение для учёта</w:t>
+        </w:r>
+      </w:hyperlink>
+      <w:r>
+        <w:rPr>
+          <w:rFonts w:ascii="Arial" w:hAnsi="Arial" w:eastAsia="Arial" w:cs="Arial"/>
+          <w:b w:val="0"/>
+          <w:i w:val="0"/>
+        </w:rPr>
+        <w:t>.</w:t>
+      </w:r>
+    </w:p>
+    <w:p>
+      <w:pPr>
+        <w:pStyle w:val="ChecklistText"/>
+      </w:pPr>
+      <w:r>
+        <w:rPr>
+          <w:rFonts w:ascii="Arial" w:hAnsi="Arial" w:eastAsia="Arial" w:cs="Arial"/>
+          <w:b w:val="0"/>
+          <w:i w:val="0"/>
+        </w:rPr>
+        <w:t xml:space="preserve">☐ Общий </w:t>
+      </w:r>
+      <w:hyperlink r:id="rId44">
+        <w:r>
+          <w:rPr>
+            <w:color w:val="1F5E4A"/>
+            <w:u w:val="single"/>
+            <w:rFonts w:ascii="Arial" w:hAnsi="Arial" w:eastAsia="Arial" w:cs="Arial"/>
+          </w:rPr>
+          <w:t>чат сообщества</w:t>
+        </w:r>
+      </w:hyperlink>
+      <w:r>
+        <w:rPr>
+          <w:rFonts w:ascii="Arial" w:hAnsi="Arial" w:eastAsia="Arial" w:cs="Arial"/>
+          <w:b w:val="0"/>
+          <w:i w:val="0"/>
+        </w:rPr>
+        <w:t>, даже если пока нет возможности активно его вести.</w:t>
+      </w:r>
+    </w:p>
+    <w:p>
+      <w:pPr>
+        <w:pStyle w:val="ChecklistText"/>
+      </w:pPr>
+      <w:r>
+        <w:rPr>
+          <w:rFonts w:ascii="Arial" w:hAnsi="Arial" w:eastAsia="Arial" w:cs="Arial"/>
+          <w:b w:val="0"/>
+          <w:i w:val="0"/>
+        </w:rPr>
+        <w:t>☐ У каждого человека записаны запрос, следующий шаг и дата связи.</w:t>
+      </w:r>
+    </w:p>
+    <w:p>
+      <w:pPr>
+        <w:pStyle w:val="ChecklistText"/>
+      </w:pPr>
+      <w:r>
+        <w:rPr>
+          <w:rFonts w:ascii="Arial" w:hAnsi="Arial" w:eastAsia="Arial" w:cs="Arial"/>
+          <w:b w:val="0"/>
+          <w:i w:val="0"/>
+        </w:rPr>
+        <w:t xml:space="preserve">☐ Под рукой </w:t>
+      </w:r>
+      <w:hyperlink r:id="rId46">
+        <w:r>
+          <w:rPr>
+            <w:color w:val="1F5E4A"/>
+            <w:u w:val="single"/>
+            <w:rFonts w:ascii="Arial" w:hAnsi="Arial" w:eastAsia="Arial" w:cs="Arial"/>
+          </w:rPr>
+          <w:t>материалы и сообщения</w:t>
+        </w:r>
+      </w:hyperlink>
+      <w:r>
+        <w:rPr>
+          <w:rFonts w:ascii="Arial" w:hAnsi="Arial" w:eastAsia="Arial" w:cs="Arial"/>
+          <w:b w:val="0"/>
+          <w:i w:val="0"/>
+        </w:rPr>
+        <w:t>, которые можно скопировать.</w:t>
+      </w:r>
+    </w:p>
+    <w:p>
+      <w:pPr>
+        <w:pStyle w:val="ChecklistText"/>
+      </w:pPr>
+      <w:r>
+        <w:rPr>
+          <w:rFonts w:ascii="Arial" w:hAnsi="Arial" w:eastAsia="Arial" w:cs="Arial"/>
+          <w:b w:val="0"/>
+          <w:i w:val="0"/>
+        </w:rPr>
+        <w:t>☐ Регулярная проверка договорённостей и одно улучшение заботы в месяц.</w:t>
+      </w:r>
+    </w:p>
+    <w:p>
+      <w:pPr>
+        <w:pStyle w:val="Heading3"/>
+      </w:pPr>
+      <w:r>
         <w:t>Сделать сначала</w:t>
       </w:r>
     </w:p>
@@ -5403,7 +7629,7 @@
         </w:rPr>
         <w:t xml:space="preserve">1. Назначьте заботника, подготовьте приложение для учёта и общий чат. </w:t>
       </w:r>
-      <w:hyperlink r:id="rId36">
+      <w:hyperlink r:id="rId43">
         <w:r>
           <w:rPr>
             <w:color w:val="1F5E4A"/>
@@ -5421,7 +7647,7 @@
         </w:rPr>
         <w:t xml:space="preserve"> · </w:t>
       </w:r>
-      <w:hyperlink r:id="rId37">
+      <w:hyperlink r:id="rId44">
         <w:r>
           <w:rPr>
             <w:color w:val="1F5E4A"/>
@@ -5444,7 +7670,7 @@
         </w:rPr>
         <w:t xml:space="preserve">2. Ответьте на запрос человека и договоритесь о ближайшем шаге. </w:t>
       </w:r>
-      <w:hyperlink r:id="rId38">
+      <w:hyperlink r:id="rId47">
         <w:r>
           <w:rPr>
             <w:color w:val="1F5E4A"/>
@@ -5467,7 +7693,7 @@
         </w:rPr>
         <w:t xml:space="preserve">3. Перед встречей объясните дорогу и формат; на встрече помогите освоиться. </w:t>
       </w:r>
-      <w:hyperlink r:id="rId39">
+      <w:hyperlink r:id="rId48">
         <w:r>
           <w:rPr>
             <w:color w:val="1F5E4A"/>
@@ -5490,7 +7716,7 @@
         </w:rPr>
         <w:t xml:space="preserve">4. После встречи спросите впечатления, отправьте один нужный материал и запишите следующую договорённость. </w:t>
       </w:r>
-      <w:hyperlink r:id="rId40">
+      <w:hyperlink r:id="rId49">
         <w:r>
           <w:rPr>
             <w:color w:val="1F5E4A"/>
@@ -5560,7 +7786,7 @@
           <w:b w:val="0"/>
           <w:i w:val="0"/>
         </w:rPr>
-        <w:t>Помогайте двигаться к самостоятельной практике, базовому курсу, сообществу и индивидуальному обучению по готовности человека. Путь не жёсткий: следующий шаг выбирается вместе с человеком.</w:t>
+        <w:t>Каждый месяц выберите одно улучшение по запросам людей: удобство приложения, качество чата, нужный шаблон сообщения или передачу между ролями. На следующем разборе проверьте, стало ли проще человеку и заботнику. Помогайте двигаться к самостоятельной практике, базовому курсу, сообществу и индивидуальному обучению по готовности человека. Путь не жёсткий: следующий шаг выбирается вместе с человеком.</w:t>
       </w:r>
     </w:p>
     <w:p>
@@ -5613,7 +7839,7 @@
       </w:r>
     </w:p>
     <w:p>
-      <w:hyperlink r:id="rId38">
+      <w:hyperlink r:id="rId47">
         <w:r>
           <w:rPr>
             <w:color w:val="1F5E4A"/>
@@ -5687,7 +7913,7 @@
       </w:r>
     </w:p>
     <w:p>
-      <w:hyperlink r:id="rId34">
+      <w:hyperlink r:id="rId41">
         <w:r>
           <w:rPr>
             <w:color w:val="1F5E4A"/>
@@ -5893,7 +8119,7 @@
       </w:r>
     </w:p>
     <w:p>
-      <w:hyperlink r:id="rId41">
+      <w:hyperlink r:id="rId50">
         <w:r>
           <w:rPr>
             <w:color w:val="1F5E4A"/>
@@ -5944,7 +8170,7 @@
       </w:r>
     </w:p>
     <w:p>
-      <w:hyperlink r:id="rId36">
+      <w:hyperlink r:id="rId43">
         <w:r>
           <w:rPr>
             <w:color w:val="1F5E4A"/>
@@ -6970,7 +9196,7 @@
         </w:rPr>
         <w:t xml:space="preserve">3. Ответить на вопрос или дать один подходящий материал: </w:t>
       </w:r>
-      <w:hyperlink r:id="rId42">
+      <w:hyperlink r:id="rId46">
         <w:r>
           <w:rPr>
             <w:color w:val="1F5E4A"/>
@@ -7179,7 +9405,7 @@
       </w:r>
     </w:p>
     <w:p>
-      <w:hyperlink r:id="rId43">
+      <w:hyperlink r:id="rId51">
         <w:r>
           <w:rPr>
             <w:color w:val="1F5E4A"/>
@@ -7209,7 +9435,7 @@
       </w:r>
     </w:p>
     <w:p>
-      <w:hyperlink r:id="rId44">
+      <w:hyperlink r:id="rId52">
         <w:r>
           <w:rPr>
             <w:color w:val="1F5E4A"/>
@@ -7239,7 +9465,7 @@
       </w:r>
     </w:p>
     <w:p>
-      <w:hyperlink r:id="rId45">
+      <w:hyperlink r:id="rId53">
         <w:r>
           <w:rPr>
             <w:color w:val="1F5E4A"/>
@@ -7269,7 +9495,7 @@
       </w:r>
     </w:p>
     <w:p>
-      <w:hyperlink r:id="rId46">
+      <w:hyperlink r:id="rId54">
         <w:r>
           <w:rPr>
             <w:color w:val="1F5E4A"/>
@@ -7299,7 +9525,7 @@
       </w:r>
     </w:p>
     <w:p>
-      <w:hyperlink r:id="rId47">
+      <w:hyperlink r:id="rId55">
         <w:r>
           <w:rPr>
             <w:color w:val="1F5E4A"/>
@@ -7311,7 +9537,7 @@
       </w:hyperlink>
     </w:p>
     <w:p>
-      <w:hyperlink r:id="rId42">
+      <w:hyperlink r:id="rId46">
         <w:r>
           <w:rPr>
             <w:color w:val="1F5E4A"/>
@@ -8507,7 +10733,7 @@
       </w:r>
     </w:p>
     <w:p>
-      <w:hyperlink r:id="rId21">
+      <w:hyperlink r:id="rId25">
         <w:r>
           <w:rPr>
             <w:color w:val="1F5E4A"/>
@@ -8944,7 +11170,7 @@
         </w:rPr>
         <w:t xml:space="preserve">1. Откройте </w:t>
       </w:r>
-      <w:hyperlink r:id="rId21">
+      <w:hyperlink r:id="rId25">
         <w:r>
           <w:rPr>
             <w:color w:val="1F5E4A"/>
@@ -10231,7 +12457,7 @@
       </w:r>
     </w:p>
     <w:p>
-      <w:hyperlink r:id="rId48">
+      <w:hyperlink r:id="rId56">
         <w:r>
           <w:rPr>
             <w:color w:val="1F5E4A"/>
@@ -10261,7 +12487,7 @@
       </w:r>
     </w:p>
     <w:p>
-      <w:hyperlink r:id="rId44">
+      <w:hyperlink r:id="rId52">
         <w:r>
           <w:rPr>
             <w:color w:val="1F5E4A"/>
@@ -10291,7 +12517,7 @@
       </w:r>
     </w:p>
     <w:p>
-      <w:hyperlink r:id="rId49">
+      <w:hyperlink r:id="rId57">
         <w:r>
           <w:rPr>
             <w:color w:val="1F5E4A"/>
@@ -10303,7 +12529,7 @@
       </w:hyperlink>
     </w:p>
     <w:p>
-      <w:hyperlink r:id="rId45">
+      <w:hyperlink r:id="rId53">
         <w:r>
           <w:rPr>
             <w:color w:val="1F5E4A"/>
@@ -10315,7 +12541,7 @@
       </w:hyperlink>
     </w:p>
     <w:p>
-      <w:hyperlink r:id="rId50">
+      <w:hyperlink r:id="rId58">
         <w:r>
           <w:rPr>
             <w:color w:val="1F5E4A"/>
@@ -10355,7 +12581,7 @@
       </w:r>
     </w:p>
     <w:p>
-      <w:hyperlink r:id="rId51">
+      <w:hyperlink r:id="rId59">
         <w:r>
           <w:rPr>
             <w:color w:val="1F5E4A"/>
@@ -10367,7 +12593,7 @@
       </w:hyperlink>
     </w:p>
     <w:p>
-      <w:hyperlink r:id="rId52">
+      <w:hyperlink r:id="rId60">
         <w:r>
           <w:rPr>
             <w:color w:val="1F5E4A"/>
@@ -10379,7 +12605,7 @@
       </w:hyperlink>
     </w:p>
     <w:p>
-      <w:hyperlink r:id="rId50">
+      <w:hyperlink r:id="rId58">
         <w:r>
           <w:rPr>
             <w:color w:val="1F5E4A"/>
@@ -10419,7 +12645,7 @@
       </w:r>
     </w:p>
     <w:p>
-      <w:hyperlink r:id="rId53">
+      <w:hyperlink r:id="rId61">
         <w:r>
           <w:rPr>
             <w:color w:val="1F5E4A"/>
@@ -10431,7 +12657,7 @@
       </w:hyperlink>
     </w:p>
     <w:p>
-      <w:hyperlink r:id="rId46">
+      <w:hyperlink r:id="rId54">
         <w:r>
           <w:rPr>
             <w:color w:val="1F5E4A"/>
@@ -10443,7 +12669,7 @@
       </w:hyperlink>
     </w:p>
     <w:p>
-      <w:hyperlink r:id="rId50">
+      <w:hyperlink r:id="rId58">
         <w:r>
           <w:rPr>
             <w:color w:val="1F5E4A"/>
@@ -10483,7 +12709,7 @@
       </w:r>
     </w:p>
     <w:p>
-      <w:hyperlink r:id="rId54">
+      <w:hyperlink r:id="rId62">
         <w:r>
           <w:rPr>
             <w:color w:val="1F5E4A"/>
@@ -10495,7 +12721,7 @@
       </w:hyperlink>
     </w:p>
     <w:p>
-      <w:hyperlink r:id="rId55">
+      <w:hyperlink r:id="rId63">
         <w:r>
           <w:rPr>
             <w:color w:val="1F5E4A"/>
@@ -10507,7 +12733,7 @@
       </w:hyperlink>
     </w:p>
     <w:p>
-      <w:hyperlink r:id="rId50">
+      <w:hyperlink r:id="rId58">
         <w:r>
           <w:rPr>
             <w:color w:val="1F5E4A"/>
@@ -10547,7 +12773,7 @@
       </w:r>
     </w:p>
     <w:p>
-      <w:hyperlink r:id="rId56">
+      <w:hyperlink r:id="rId64">
         <w:r>
           <w:rPr>
             <w:color w:val="1F5E4A"/>
@@ -10559,7 +12785,7 @@
       </w:hyperlink>
     </w:p>
     <w:p>
-      <w:hyperlink r:id="rId57">
+      <w:hyperlink r:id="rId65">
         <w:r>
           <w:rPr>
             <w:color w:val="1F5E4A"/>
@@ -10571,7 +12797,7 @@
       </w:hyperlink>
     </w:p>
     <w:p>
-      <w:hyperlink r:id="rId50">
+      <w:hyperlink r:id="rId58">
         <w:r>
           <w:rPr>
             <w:color w:val="1F5E4A"/>
@@ -10611,7 +12837,7 @@
       </w:r>
     </w:p>
     <w:p>
-      <w:hyperlink r:id="rId58">
+      <w:hyperlink r:id="rId66">
         <w:r>
           <w:rPr>
             <w:color w:val="1F5E4A"/>
@@ -10623,7 +12849,7 @@
       </w:hyperlink>
     </w:p>
     <w:p>
-      <w:hyperlink r:id="rId59">
+      <w:hyperlink r:id="rId67">
         <w:r>
           <w:rPr>
             <w:color w:val="1F5E4A"/>
@@ -10635,7 +12861,7 @@
       </w:hyperlink>
     </w:p>
     <w:p>
-      <w:hyperlink r:id="rId50">
+      <w:hyperlink r:id="rId58">
         <w:r>
           <w:rPr>
             <w:color w:val="1F5E4A"/>
@@ -10675,7 +12901,7 @@
       </w:r>
     </w:p>
     <w:p>
-      <w:hyperlink r:id="rId43">
+      <w:hyperlink r:id="rId51">
         <w:r>
           <w:rPr>
             <w:color w:val="1F5E4A"/>
@@ -10705,7 +12931,7 @@
       </w:r>
     </w:p>
     <w:p>
-      <w:hyperlink r:id="rId60">
+      <w:hyperlink r:id="rId68">
         <w:r>
           <w:rPr>
             <w:color w:val="1F5E4A"/>
@@ -10717,7 +12943,7 @@
       </w:hyperlink>
     </w:p>
     <w:p>
-      <w:hyperlink r:id="rId61">
+      <w:hyperlink r:id="rId69">
         <w:r>
           <w:rPr>
             <w:color w:val="1F5E4A"/>
@@ -10747,7 +12973,7 @@
       </w:r>
     </w:p>
     <w:p>
-      <w:hyperlink r:id="rId47">
+      <w:hyperlink r:id="rId55">
         <w:r>
           <w:rPr>
             <w:color w:val="1F5E4A"/>
@@ -10759,7 +12985,7 @@
       </w:hyperlink>
     </w:p>
     <w:p>
-      <w:hyperlink r:id="rId62">
+      <w:hyperlink r:id="rId70">
         <w:r>
           <w:rPr>
             <w:color w:val="1F5E4A"/>
@@ -10789,7 +13015,7 @@
       </w:r>
     </w:p>
     <w:p>
-      <w:hyperlink r:id="rId63">
+      <w:hyperlink r:id="rId71">
         <w:r>
           <w:rPr>
             <w:color w:val="1F5E4A"/>
@@ -10801,7 +13027,7 @@
       </w:hyperlink>
     </w:p>
     <w:p>
-      <w:hyperlink r:id="rId64">
+      <w:hyperlink r:id="rId72">
         <w:r>
           <w:rPr>
             <w:color w:val="1F5E4A"/>
@@ -10813,7 +13039,7 @@
       </w:hyperlink>
     </w:p>
     <w:p>
-      <w:hyperlink r:id="rId50">
+      <w:hyperlink r:id="rId58">
         <w:r>
           <w:rPr>
             <w:color w:val="1F5E4A"/>
@@ -10912,7 +13138,7 @@
       </w:r>
     </w:p>
     <w:p>
-      <w:hyperlink r:id="rId65">
+      <w:hyperlink r:id="rId73">
         <w:r>
           <w:rPr>
             <w:color w:val="1F5E4A"/>
@@ -10935,7 +13161,7 @@
         </w:rPr>
         <w:t xml:space="preserve">• </w:t>
       </w:r>
-      <w:hyperlink r:id="rId33">
+      <w:hyperlink r:id="rId40">
         <w:r>
           <w:rPr>
             <w:color w:val="1F5E4A"/>
@@ -10958,7 +13184,7 @@
         </w:rPr>
         <w:t xml:space="preserve">• </w:t>
       </w:r>
-      <w:hyperlink r:id="rId66">
+      <w:hyperlink r:id="rId74">
         <w:r>
           <w:rPr>
             <w:color w:val="1F5E4A"/>
@@ -10981,7 +13207,7 @@
         </w:rPr>
         <w:t xml:space="preserve">• </w:t>
       </w:r>
-      <w:hyperlink r:id="rId25">
+      <w:hyperlink r:id="rId29">
         <w:r>
           <w:rPr>
             <w:color w:val="1F5E4A"/>
@@ -10993,7 +13219,7 @@
       </w:hyperlink>
     </w:p>
     <w:p>
-      <w:hyperlink r:id="rId26">
+      <w:hyperlink r:id="rId30">
         <w:r>
           <w:rPr>
             <w:color w:val="1F5E4A"/>
@@ -11008,7 +13234,7 @@
       <w:pPr>
         <w:spacing w:before="120"/>
       </w:pPr>
-      <w:hyperlink r:id="rId67">
+      <w:hyperlink r:id="rId75">
         <w:r>
           <w:rPr>
             <w:color w:val="1F5E4A"/>
@@ -11042,6 +13268,24 @@
           <w:b w:val="0"/>
           <w:i w:val="0"/>
         </w:rPr>
+        <w:t>Помогайте команде действовать согласованно, чтобы Прачара росла.</w:t>
+      </w:r>
+    </w:p>
+    <w:p>
+      <w:pPr>
+        <w:pStyle w:val="Heading4"/>
+      </w:pPr>
+      <w:r>
+        <w:t>Смысл направления</w:t>
+      </w:r>
+    </w:p>
+    <w:p>
+      <w:r>
+        <w:rPr>
+          <w:rFonts w:ascii="Arial" w:hAnsi="Arial" w:eastAsia="Arial" w:cs="Arial"/>
+          <w:b w:val="0"/>
+          <w:i w:val="0"/>
+        </w:rPr>
         <w:t>Секретарь отвечает не за выполнение всех задач лично, а за работу всей системы Прачары юнита.</w:t>
       </w:r>
     </w:p>
@@ -11068,6 +13312,156 @@
         <w:pStyle w:val="Heading3"/>
       </w:pPr>
       <w:r>
+        <w:t>Регулярные задачи</w:t>
+      </w:r>
+    </w:p>
+    <w:p>
+      <w:pPr>
+        <w:pStyle w:val="BulletText"/>
+      </w:pPr>
+      <w:r>
+        <w:rPr>
+          <w:rFonts w:ascii="Arial" w:hAnsi="Arial" w:eastAsia="Arial" w:cs="Arial"/>
+          <w:b w:val="0"/>
+          <w:i w:val="0"/>
+        </w:rPr>
+        <w:t xml:space="preserve">• </w:t>
+      </w:r>
+      <w:hyperlink r:id="rId76">
+        <w:r>
+          <w:rPr>
+            <w:color w:val="1F5E4A"/>
+            <w:u w:val="single"/>
+            <w:rFonts w:ascii="Arial" w:hAnsi="Arial" w:eastAsia="Arial" w:cs="Arial"/>
+          </w:rPr>
+          <w:t>Задачи команды</w:t>
+        </w:r>
+      </w:hyperlink>
+    </w:p>
+    <w:p>
+      <w:pPr>
+        <w:pStyle w:val="BulletText"/>
+      </w:pPr>
+      <w:r>
+        <w:rPr>
+          <w:rFonts w:ascii="Arial" w:hAnsi="Arial" w:eastAsia="Arial" w:cs="Arial"/>
+          <w:b w:val="0"/>
+          <w:i w:val="0"/>
+        </w:rPr>
+        <w:t xml:space="preserve">• </w:t>
+      </w:r>
+      <w:hyperlink r:id="rId77">
+        <w:r>
+          <w:rPr>
+            <w:color w:val="1F5E4A"/>
+            <w:u w:val="single"/>
+            <w:rFonts w:ascii="Arial" w:hAnsi="Arial" w:eastAsia="Arial" w:cs="Arial"/>
+          </w:rPr>
+          <w:t>Разбор команды</w:t>
+        </w:r>
+      </w:hyperlink>
+    </w:p>
+    <w:p>
+      <w:pPr>
+        <w:pStyle w:val="BulletText"/>
+      </w:pPr>
+      <w:r>
+        <w:rPr>
+          <w:rFonts w:ascii="Arial" w:hAnsi="Arial" w:eastAsia="Arial" w:cs="Arial"/>
+          <w:b w:val="0"/>
+          <w:i w:val="0"/>
+        </w:rPr>
+        <w:t xml:space="preserve">• </w:t>
+      </w:r>
+      <w:hyperlink r:id="rId78">
+        <w:r>
+          <w:rPr>
+            <w:color w:val="1F5E4A"/>
+            <w:u w:val="single"/>
+            <w:rFonts w:ascii="Arial" w:hAnsi="Arial" w:eastAsia="Arial" w:cs="Arial"/>
+          </w:rPr>
+          <w:t>Рост · месяц</w:t>
+        </w:r>
+      </w:hyperlink>
+    </w:p>
+    <w:p>
+      <w:pPr>
+        <w:pStyle w:val="Heading4"/>
+      </w:pPr>
+      <w:r>
+        <w:t>Обязательный минимум</w:t>
+      </w:r>
+    </w:p>
+    <w:p>
+      <w:pPr>
+        <w:pStyle w:val="ChecklistText"/>
+      </w:pPr>
+      <w:r>
+        <w:rPr>
+          <w:rFonts w:ascii="Arial" w:hAnsi="Arial" w:eastAsia="Arial" w:cs="Arial"/>
+          <w:b w:val="0"/>
+          <w:i w:val="0"/>
+        </w:rPr>
+        <w:t>☐ Назначены ответственные за рекламу, программы и заботу.</w:t>
+      </w:r>
+    </w:p>
+    <w:p>
+      <w:pPr>
+        <w:pStyle w:val="ChecklistText"/>
+      </w:pPr>
+      <w:r>
+        <w:rPr>
+          <w:rFonts w:ascii="Arial" w:hAnsi="Arial" w:eastAsia="Arial" w:cs="Arial"/>
+          <w:b w:val="0"/>
+          <w:i w:val="0"/>
+        </w:rPr>
+        <w:t>☐ Есть календарь встреч и общий список ближайших задач со сроками.</w:t>
+      </w:r>
+    </w:p>
+    <w:p>
+      <w:pPr>
+        <w:pStyle w:val="ChecklistText"/>
+      </w:pPr>
+      <w:r>
+        <w:rPr>
+          <w:rFonts w:ascii="Arial" w:hAnsi="Arial" w:eastAsia="Arial" w:cs="Arial"/>
+          <w:b w:val="0"/>
+          <w:i w:val="0"/>
+        </w:rPr>
+        <w:t>☐ Согласованы передачи между направлениями: обращение, встреча, сопровождение.</w:t>
+      </w:r>
+    </w:p>
+    <w:p>
+      <w:pPr>
+        <w:pStyle w:val="ChecklistText"/>
+      </w:pPr>
+      <w:r>
+        <w:rPr>
+          <w:rFonts w:ascii="Arial" w:hAnsi="Arial" w:eastAsia="Arial" w:cs="Arial"/>
+          <w:b w:val="0"/>
+          <w:i w:val="0"/>
+        </w:rPr>
+        <w:t>☐ Команда регулярно разбирает результаты.</w:t>
+      </w:r>
+    </w:p>
+    <w:p>
+      <w:pPr>
+        <w:pStyle w:val="ChecklistText"/>
+      </w:pPr>
+      <w:r>
+        <w:rPr>
+          <w:rFonts w:ascii="Arial" w:hAnsi="Arial" w:eastAsia="Arial" w:cs="Arial"/>
+          <w:b w:val="0"/>
+          <w:i w:val="0"/>
+        </w:rPr>
+        <w:t>☐ У каждого направления есть одно понятное усиление на текущий месяц.</w:t>
+      </w:r>
+    </w:p>
+    <w:p>
+      <w:pPr>
+        <w:pStyle w:val="Heading3"/>
+      </w:pPr>
+      <w:r>
         <w:t>Сделать сначала</w:t>
       </w:r>
     </w:p>
@@ -11101,7 +13495,7 @@
         </w:rPr>
         <w:t xml:space="preserve">1. Назначьте ответственного за каждое направление. Один человек может совмещать роли. </w:t>
       </w:r>
-      <w:hyperlink r:id="rId68">
+      <w:hyperlink r:id="rId79">
         <w:r>
           <w:rPr>
             <w:color w:val="1F5E4A"/>
@@ -11124,7 +13518,7 @@
         </w:rPr>
         <w:t xml:space="preserve">2. Согласуйте ближайшую программу: кто проводит, кого приглашаем и кто сопровождает. </w:t>
       </w:r>
-      <w:hyperlink r:id="rId11">
+      <w:hyperlink r:id="rId16">
         <w:r>
           <w:rPr>
             <w:color w:val="1F5E4A"/>
@@ -11147,7 +13541,7 @@
         </w:rPr>
         <w:t xml:space="preserve">3. Запишите по одной ближайшей задаче на направление: действие, ответственный, срок, ожидаемый результат. </w:t>
       </w:r>
-      <w:hyperlink r:id="rId69">
+      <w:hyperlink r:id="rId76">
         <w:r>
           <w:rPr>
             <w:color w:val="1F5E4A"/>
@@ -11170,7 +13564,7 @@
         </w:rPr>
         <w:t xml:space="preserve">4. Договоритесь о следующем разборе: что выполнено, сколько людей обратилось и пришло, какой следующий шаг. </w:t>
       </w:r>
-      <w:hyperlink r:id="rId70">
+      <w:hyperlink r:id="rId77">
         <w:r>
           <w:rPr>
             <w:color w:val="1F5E4A"/>
@@ -11240,7 +13634,7 @@
           <w:b w:val="0"/>
           <w:i w:val="0"/>
         </w:rPr>
-        <w:t>Обучайте команду и усиливайте слабое направление. Подключайте новые инструменты и форматы по готовности людей, фиксируйте удачные решения и передавайте опыт другим юнитам.</w:t>
+        <w:t>В начале месяца согласуйте по одному усилению каждого блока: рекламная гипотеза, дополнительная программа, улучшение заботы. В конце месяца вместе разберите результат и выберите следующий шаг. Обучайте команду и усиливайте слабое направление. Подключайте новые инструменты и форматы по готовности людей, фиксируйте удачные решения и передавайте опыт другим юнитам.</w:t>
       </w:r>
     </w:p>
     <w:p>
@@ -11301,7 +13695,7 @@
       </w:r>
     </w:p>
     <w:p>
-      <w:hyperlink r:id="rId71">
+      <w:hyperlink r:id="rId80">
         <w:r>
           <w:rPr>
             <w:color w:val="1F5E4A"/>
@@ -11375,7 +13769,7 @@
       </w:r>
     </w:p>
     <w:p>
-      <w:hyperlink r:id="rId22">
+      <w:hyperlink r:id="rId26">
         <w:r>
           <w:rPr>
             <w:color w:val="1F5E4A"/>
@@ -11418,7 +13812,7 @@
       </w:r>
     </w:p>
     <w:p>
-      <w:hyperlink r:id="rId69">
+      <w:hyperlink r:id="rId76">
         <w:r>
           <w:rPr>
             <w:color w:val="1F5E4A"/>
@@ -11461,7 +13855,7 @@
       </w:r>
     </w:p>
     <w:p>
-      <w:hyperlink r:id="rId70">
+      <w:hyperlink r:id="rId77">
         <w:r>
           <w:rPr>
             <w:color w:val="1F5E4A"/>
@@ -11535,7 +13929,7 @@
       </w:r>
     </w:p>
     <w:p>
-      <w:hyperlink r:id="rId72">
+      <w:hyperlink r:id="rId81">
         <w:r>
           <w:rPr>
             <w:color w:val="1F5E4A"/>
@@ -11857,7 +14251,7 @@
         </w:rPr>
         <w:t xml:space="preserve">• </w:t>
       </w:r>
-      <w:hyperlink r:id="rId73">
+      <w:hyperlink r:id="rId82">
         <w:r>
           <w:rPr>
             <w:color w:val="1F5E4A"/>
@@ -11880,7 +14274,7 @@
         </w:rPr>
         <w:t xml:space="preserve">• </w:t>
       </w:r>
-      <w:hyperlink r:id="rId74">
+      <w:hyperlink r:id="rId83">
         <w:r>
           <w:rPr>
             <w:color w:val="1F5E4A"/>
@@ -11903,7 +14297,7 @@
         </w:rPr>
         <w:t xml:space="preserve">• </w:t>
       </w:r>
-      <w:hyperlink r:id="rId75">
+      <w:hyperlink r:id="rId84">
         <w:r>
           <w:rPr>
             <w:color w:val="1F5E4A"/>
@@ -11926,7 +14320,7 @@
         </w:rPr>
         <w:t xml:space="preserve">• </w:t>
       </w:r>
-      <w:hyperlink r:id="rId76">
+      <w:hyperlink r:id="rId85">
         <w:r>
           <w:rPr>
             <w:color w:val="1F5E4A"/>
@@ -11938,7 +14332,7 @@
       </w:hyperlink>
     </w:p>
     <w:p>
-      <w:hyperlink r:id="rId26">
+      <w:hyperlink r:id="rId30">
         <w:r>
           <w:rPr>
             <w:color w:val="1F5E4A"/>
@@ -11953,7 +14347,7 @@
       <w:pPr>
         <w:spacing w:before="120"/>
       </w:pPr>
-      <w:hyperlink r:id="rId77">
+      <w:hyperlink r:id="rId86">
         <w:r>
           <w:rPr>
             <w:color w:val="1F5E4A"/>
@@ -12002,7 +14396,7 @@
         </w:rPr>
         <w:t xml:space="preserve">1. Прочитайте </w:t>
       </w:r>
-      <w:hyperlink r:id="rId78">
+      <w:hyperlink r:id="rId87">
         <w:r>
           <w:rPr>
             <w:color w:val="1F5E4A"/>
@@ -12033,7 +14427,7 @@
         </w:rPr>
         <w:t xml:space="preserve">2. Посмотрите </w:t>
       </w:r>
-      <w:hyperlink r:id="rId79">
+      <w:hyperlink r:id="rId88">
         <w:r>
           <w:rPr>
             <w:color w:val="1F5E4A"/>
@@ -12051,7 +14445,7 @@
         </w:rPr>
         <w:t xml:space="preserve"> и </w:t>
       </w:r>
-      <w:hyperlink r:id="rId66">
+      <w:hyperlink r:id="rId74">
         <w:r>
           <w:rPr>
             <w:color w:val="1F5E4A"/>
@@ -12082,7 +14476,7 @@
         </w:rPr>
         <w:t xml:space="preserve">3. Обсудите с секретарём юнита одну конкретную задачу из </w:t>
       </w:r>
-      <w:hyperlink r:id="rId73">
+      <w:hyperlink r:id="rId82">
         <w:r>
           <w:rPr>
             <w:color w:val="1F5E4A"/>
@@ -12121,7 +14515,7 @@
         </w:rPr>
         <w:t xml:space="preserve">• </w:t>
       </w:r>
-      <w:hyperlink r:id="rId71">
+      <w:hyperlink r:id="rId80">
         <w:r>
           <w:rPr>
             <w:color w:val="1F5E4A"/>
@@ -12152,7 +14546,7 @@
         </w:rPr>
         <w:t xml:space="preserve">• </w:t>
       </w:r>
-      <w:hyperlink r:id="rId80">
+      <w:hyperlink r:id="rId89">
         <w:r>
           <w:rPr>
             <w:color w:val="1F5E4A"/>
@@ -12183,7 +14577,7 @@
         </w:rPr>
         <w:t xml:space="preserve">• </w:t>
       </w:r>
-      <w:hyperlink r:id="rId75">
+      <w:hyperlink r:id="rId84">
         <w:r>
           <w:rPr>
             <w:color w:val="1F5E4A"/>
@@ -12266,7 +14660,7 @@
         </w:rPr>
         <w:t xml:space="preserve">Когда задача станет понятнее, откройте маршрут </w:t>
       </w:r>
-      <w:hyperlink r:id="rId81">
+      <w:hyperlink r:id="rId90">
         <w:r>
           <w:rPr>
             <w:color w:val="1F5E4A"/>
@@ -12284,7 +14678,7 @@
         </w:rPr>
         <w:t xml:space="preserve">, </w:t>
       </w:r>
-      <w:hyperlink r:id="rId82">
+      <w:hyperlink r:id="rId91">
         <w:r>
           <w:rPr>
             <w:color w:val="1F5E4A"/>
@@ -12302,7 +14696,7 @@
         </w:rPr>
         <w:t xml:space="preserve"> или </w:t>
       </w:r>
-      <w:hyperlink r:id="rId83">
+      <w:hyperlink r:id="rId92">
         <w:r>
           <w:rPr>
             <w:color w:val="1F5E4A"/>
@@ -12325,7 +14719,7 @@
       <w:pPr>
         <w:spacing w:before="120"/>
       </w:pPr>
-      <w:hyperlink r:id="rId84">
+      <w:hyperlink r:id="rId93">
         <w:r>
           <w:rPr>
             <w:color w:val="1F5E4A"/>
@@ -12473,7 +14867,7 @@
             <w:pPr>
               <w:jc w:val="left"/>
             </w:pPr>
-            <w:hyperlink r:id="rId85">
+            <w:hyperlink r:id="rId94">
               <w:r>
                 <w:rPr>
                   <w:color w:val="1F5E4A"/>
@@ -12533,7 +14927,7 @@
             <w:pPr>
               <w:jc w:val="left"/>
             </w:pPr>
-            <w:hyperlink r:id="rId73">
+            <w:hyperlink r:id="rId82">
               <w:r>
                 <w:rPr>
                   <w:color w:val="1F5E4A"/>
@@ -12591,7 +14985,7 @@
             <w:pPr>
               <w:jc w:val="left"/>
             </w:pPr>
-            <w:hyperlink r:id="rId75">
+            <w:hyperlink r:id="rId84">
               <w:r>
                 <w:rPr>
                   <w:color w:val="1F5E4A"/>
@@ -12610,7 +15004,7 @@
               </w:rPr>
               <w:t xml:space="preserve">, </w:t>
             </w:r>
-            <w:hyperlink r:id="rId86">
+            <w:hyperlink r:id="rId95">
               <w:r>
                 <w:rPr>
                   <w:color w:val="1F5E4A"/>
@@ -12629,7 +15023,7 @@
               </w:rPr>
               <w:t xml:space="preserve">, </w:t>
             </w:r>
-            <w:hyperlink r:id="rId87">
+            <w:hyperlink r:id="rId96">
               <w:r>
                 <w:rPr>
                   <w:color w:val="1F5E4A"/>
@@ -12689,7 +15083,7 @@
             <w:pPr>
               <w:jc w:val="left"/>
             </w:pPr>
-            <w:hyperlink r:id="rId23">
+            <w:hyperlink r:id="rId27">
               <w:r>
                 <w:rPr>
                   <w:color w:val="1F5E4A"/>
@@ -12747,7 +15141,7 @@
             <w:pPr>
               <w:jc w:val="left"/>
             </w:pPr>
-            <w:hyperlink r:id="rId34">
+            <w:hyperlink r:id="rId41">
               <w:r>
                 <w:rPr>
                   <w:color w:val="1F5E4A"/>
@@ -12807,7 +15201,7 @@
             <w:pPr>
               <w:jc w:val="left"/>
             </w:pPr>
-            <w:hyperlink r:id="rId65">
+            <w:hyperlink r:id="rId73">
               <w:r>
                 <w:rPr>
                   <w:color w:val="1F5E4A"/>
@@ -12826,7 +15220,7 @@
               </w:rPr>
               <w:t xml:space="preserve"> и </w:t>
             </w:r>
-            <w:hyperlink r:id="rId33">
+            <w:hyperlink r:id="rId40">
               <w:r>
                 <w:rPr>
                   <w:color w:val="1F5E4A"/>
@@ -12884,7 +15278,7 @@
             <w:pPr>
               <w:jc w:val="left"/>
             </w:pPr>
-            <w:hyperlink r:id="rId25">
+            <w:hyperlink r:id="rId29">
               <w:r>
                 <w:rPr>
                   <w:color w:val="1F5E4A"/>
@@ -12944,7 +15338,7 @@
             <w:pPr>
               <w:jc w:val="left"/>
             </w:pPr>
-            <w:hyperlink r:id="rId80">
+            <w:hyperlink r:id="rId89">
               <w:r>
                 <w:rPr>
                   <w:color w:val="1F5E4A"/>
@@ -13002,7 +15396,7 @@
             <w:pPr>
               <w:jc w:val="left"/>
             </w:pPr>
-            <w:hyperlink r:id="rId22">
+            <w:hyperlink r:id="rId26">
               <w:r>
                 <w:rPr>
                   <w:color w:val="1F5E4A"/>
@@ -13062,7 +15456,7 @@
             <w:pPr>
               <w:jc w:val="left"/>
             </w:pPr>
-            <w:hyperlink r:id="rId88">
+            <w:hyperlink r:id="rId97">
               <w:r>
                 <w:rPr>
                   <w:color w:val="1F5E4A"/>
@@ -13086,7 +15480,7 @@
         </w:rPr>
         <w:t xml:space="preserve">Если материала пока нет, зафиксируйте потребность в </w:t>
       </w:r>
-      <w:hyperlink r:id="rId89">
+      <w:hyperlink r:id="rId98">
         <w:r>
           <w:rPr>
             <w:color w:val="1F5E4A"/>
@@ -13109,7 +15503,7 @@
       <w:pPr>
         <w:spacing w:before="120"/>
       </w:pPr>
-      <w:hyperlink r:id="rId90">
+      <w:hyperlink r:id="rId99">
         <w:r>
           <w:rPr>
             <w:color w:val="1F5E4A"/>
@@ -13699,7 +16093,7 @@
       <w:pPr>
         <w:spacing w:before="120"/>
       </w:pPr>
-      <w:hyperlink r:id="rId91">
+      <w:hyperlink r:id="rId100">
         <w:r>
           <w:rPr>
             <w:color w:val="1F5E4A"/>
@@ -13719,6 +16113,16 @@
       </w:r>
     </w:p>
     <w:p>
+      <w:r>
+        <w:rPr>
+          <w:rFonts w:ascii="Arial" w:hAnsi="Arial" w:eastAsia="Arial" w:cs="Arial"/>
+          <w:b w:val="0"/>
+          <w:i w:val="0"/>
+        </w:rPr>
+        <w:t>Ответственный в первую очередь поддерживает и развивает свой блок. Между направлениями согласуются передача контакта, проведение встречи и сопровождение человека. Каждый месяц у блока есть одно понятное усиление; секретарь помогает команде согласовать и разобрать результат.</w:t>
+      </w:r>
+    </w:p>
+    <w:p>
       <w:pPr>
         <w:pStyle w:val="Heading3"/>
       </w:pPr>
@@ -13926,7 +16330,30 @@
           <w:b w:val="0"/>
           <w:i w:val="0"/>
         </w:rPr>
-        <w:t>• действующее объявление на Avito с приглашением на практику или ближайшую программу.</w:t>
+        <w:t>• действующее объявление на Avito с приглашением на практику или ближайшую программу;</w:t>
+      </w:r>
+    </w:p>
+    <w:p>
+      <w:pPr>
+        <w:pStyle w:val="BulletText"/>
+      </w:pPr>
+      <w:r>
+        <w:rPr>
+          <w:rFonts w:ascii="Arial" w:hAnsi="Arial" w:eastAsia="Arial" w:cs="Arial"/>
+          <w:b w:val="0"/>
+          <w:i w:val="0"/>
+        </w:rPr>
+        <w:t>• приглашения в подходящих группах города не реже раза в месяц.</w:t>
+      </w:r>
+    </w:p>
+    <w:p>
+      <w:r>
+        <w:rPr>
+          <w:rFonts w:ascii="Arial" w:hAnsi="Arial" w:eastAsia="Arial" w:cs="Arial"/>
+          <w:b w:val="0"/>
+          <w:i w:val="0"/>
+        </w:rPr>
+        <w:t>Каждый месяц проверяется один новый инструмент или рекламная гипотеза по обращениям и реальным приходам.</w:t>
       </w:r>
     </w:p>
     <w:p>
@@ -13938,7 +16365,7 @@
         </w:rPr>
         <w:t xml:space="preserve">Подробности и готовый шаблон находятся в разделе </w:t>
       </w:r>
-      <w:hyperlink r:id="rId23">
+      <w:hyperlink r:id="rId27">
         <w:r>
           <w:rPr>
             <w:color w:val="1F5E4A"/>
@@ -14167,7 +16594,7 @@
           <w:b w:val="0"/>
           <w:i w:val="0"/>
         </w:rPr>
-        <w:t>Не менее одной коллективной медитации в неделю как базовой точки присутствия юнита.</w:t>
+        <w:t>Не менее одной коллективной медитации в неделю как базовой точки присутствия юнита. Каждый месяц — дополнительная программа по интересам участников: например, кино с обсуждением, поход или тематическая встреча.</w:t>
       </w:r>
     </w:p>
     <w:p>
@@ -14419,7 +16846,17 @@
           <w:b w:val="0"/>
           <w:i w:val="0"/>
         </w:rPr>
-        <w:t>У юнита должен быть чат для новичков и практикующих в доступной людям социальной сети или мессенджере.</w:t>
+        <w:t>У юнита должны быть приложение для учёта пути человека и чат для новичков и практикующих в доступной людям социальной сети или мессенджере. В приложении фиксируются запрос, ответственный, следующий шаг и дата связи.</w:t>
+      </w:r>
+    </w:p>
+    <w:p>
+      <w:r>
+        <w:rPr>
+          <w:rFonts w:ascii="Arial" w:hAnsi="Arial" w:eastAsia="Arial" w:cs="Arial"/>
+          <w:b w:val="0"/>
+          <w:i w:val="0"/>
+        </w:rPr>
+        <w:t>Каждый месяц выбирается одно улучшение заботы: чат, учёт, материалы или передача между ролями.</w:t>
       </w:r>
     </w:p>
     <w:p>
@@ -14503,7 +16940,7 @@
       <w:pPr>
         <w:spacing w:before="120"/>
       </w:pPr>
-      <w:hyperlink r:id="rId92">
+      <w:hyperlink r:id="rId101">
         <w:r>
           <w:rPr>
             <w:color w:val="1F5E4A"/>
@@ -14642,7 +17079,7 @@
       <w:pPr>
         <w:spacing w:before="120"/>
       </w:pPr>
-      <w:hyperlink r:id="rId93">
+      <w:hyperlink r:id="rId102">
         <w:r>
           <w:rPr>
             <w:color w:val="1F5E4A"/>
@@ -14872,7 +17309,7 @@
       <w:pPr>
         <w:spacing w:before="120"/>
       </w:pPr>
-      <w:hyperlink r:id="rId94">
+      <w:hyperlink r:id="rId103">
         <w:r>
           <w:rPr>
             <w:color w:val="1F5E4A"/>
@@ -15045,7 +17482,7 @@
       <w:pPr>
         <w:spacing w:before="120"/>
       </w:pPr>
-      <w:hyperlink r:id="rId95">
+      <w:hyperlink r:id="rId104">
         <w:r>
           <w:rPr>
             <w:color w:val="1F5E4A"/>
@@ -19068,7 +21505,7 @@
         </w:rPr>
         <w:t xml:space="preserve">Показатели для целей описаны в </w:t>
       </w:r>
-      <w:hyperlink r:id="rId22">
+      <w:hyperlink r:id="rId26">
         <w:r>
           <w:rPr>
             <w:color w:val="1F5E4A"/>
@@ -19157,7 +21594,7 @@
       <w:pPr>
         <w:spacing w:before="120"/>
       </w:pPr>
-      <w:hyperlink r:id="rId96">
+      <w:hyperlink r:id="rId105">
         <w:r>
           <w:rPr>
             <w:color w:val="1F5E4A"/>
@@ -19414,7 +21851,7 @@
       <w:pPr>
         <w:spacing w:before="120"/>
       </w:pPr>
-      <w:hyperlink r:id="rId97">
+      <w:hyperlink r:id="rId106">
         <w:r>
           <w:rPr>
             <w:color w:val="1F5E4A"/>
@@ -19634,7 +22071,7 @@
       <w:pPr>
         <w:spacing w:before="120"/>
       </w:pPr>
-      <w:hyperlink r:id="rId98">
+      <w:hyperlink r:id="rId107">
         <w:r>
           <w:rPr>
             <w:color w:val="1F5E4A"/>
@@ -20039,7 +22476,7 @@
       <w:pPr>
         <w:spacing w:before="120"/>
       </w:pPr>
-      <w:hyperlink r:id="rId99">
+      <w:hyperlink r:id="rId108">
         <w:r>
           <w:rPr>
             <w:color w:val="1F5E4A"/>
@@ -20267,7 +22704,7 @@
       <w:pPr>
         <w:spacing w:before="120"/>
       </w:pPr>
-      <w:hyperlink r:id="rId100">
+      <w:hyperlink r:id="rId109">
         <w:r>
           <w:rPr>
             <w:color w:val="1F5E4A"/>
@@ -20431,7 +22868,7 @@
       <w:pPr>
         <w:spacing w:before="120"/>
       </w:pPr>
-      <w:hyperlink r:id="rId101">
+      <w:hyperlink r:id="rId110">
         <w:r>
           <w:rPr>
             <w:color w:val="1F5E4A"/>
@@ -20546,7 +22983,7 @@
       <w:pPr>
         <w:spacing w:before="120"/>
       </w:pPr>
-      <w:hyperlink r:id="rId102">
+      <w:hyperlink r:id="rId111">
         <w:r>
           <w:rPr>
             <w:color w:val="1F5E4A"/>
@@ -20633,7 +23070,7 @@
       <w:pPr>
         <w:spacing w:before="120"/>
       </w:pPr>
-      <w:hyperlink r:id="rId103">
+      <w:hyperlink r:id="rId112">
         <w:r>
           <w:rPr>
             <w:color w:val="1F5E4A"/>
@@ -20764,6 +23201,52 @@
         <w:pStyle w:val="Heading3"/>
       </w:pPr>
       <w:r>
+        <w:t>Организация рекламы</w:t>
+      </w:r>
+    </w:p>
+    <w:p>
+      <w:r>
+        <w:rPr>
+          <w:rFonts w:ascii="Arial" w:hAnsi="Arial" w:eastAsia="Arial" w:cs="Arial"/>
+          <w:b w:val="0"/>
+          <w:i w:val="0"/>
+        </w:rPr>
+        <w:t>Сначала подготовьте посадочные страницы: соцсети, Avito, страницу города или коллективной медитации. Затем выберите способ привлечения. Без бюджета: личный бренд, бесплатные группы, сайт КМ, отбор площадок. С бюджетом: таргет, контекст, платные группы и онлайн- или офлайн-размещения.</w:t>
+      </w:r>
+    </w:p>
+    <w:p>
+      <w:r>
+        <w:rPr>
+          <w:rFonts w:ascii="Arial" w:hAnsi="Arial" w:eastAsia="Arial" w:cs="Arial"/>
+          <w:b w:val="0"/>
+          <w:i w:val="0"/>
+        </w:rPr>
+        <w:t xml:space="preserve">Каждый месяц проверяйте один новый инструмент или рекламную гипотезу: цель, действие, ответственный, срок, бюджет, обращения, приходы и вывод. Работающий минимум продолжайте поддерживать. </w:t>
+      </w:r>
+      <w:hyperlink r:id="rId113">
+        <w:r>
+          <w:rPr>
+            <w:color w:val="1F5E4A"/>
+            <w:u w:val="single"/>
+            <w:rFonts w:ascii="Arial" w:hAnsi="Arial" w:eastAsia="Arial" w:cs="Arial"/>
+          </w:rPr>
+          <w:t>Группы города, цикл теста и черновик парсинга</w:t>
+        </w:r>
+      </w:hyperlink>
+      <w:r>
+        <w:rPr>
+          <w:rFonts w:ascii="Arial" w:hAnsi="Arial" w:eastAsia="Arial" w:cs="Arial"/>
+          <w:b w:val="0"/>
+          <w:i w:val="0"/>
+        </w:rPr>
+        <w:t>.</w:t>
+      </w:r>
+    </w:p>
+    <w:p>
+      <w:pPr>
+        <w:pStyle w:val="Heading3"/>
+      </w:pPr>
+      <w:r>
         <w:t>Рабочий порядок инструментов</w:t>
       </w:r>
     </w:p>
@@ -20960,7 +23443,7 @@
         </w:rPr>
         <w:t xml:space="preserve">Подробные инструкции, промпты и порядок учёта визиток находятся в рабочем разделе </w:t>
       </w:r>
-      <w:hyperlink r:id="rId104">
+      <w:hyperlink r:id="rId114">
         <w:r>
           <w:rPr>
             <w:color w:val="1F5E4A"/>
@@ -21020,7 +23503,20 @@
           <w:b w:val="0"/>
           <w:i w:val="0"/>
         </w:rPr>
-        <w:t>☐ объявление на Avito.</w:t>
+        <w:t>☐ объявление на Avito;</w:t>
+      </w:r>
+    </w:p>
+    <w:p>
+      <w:pPr>
+        <w:pStyle w:val="ChecklistText"/>
+      </w:pPr>
+      <w:r>
+        <w:rPr>
+          <w:rFonts w:ascii="Arial" w:hAnsi="Arial" w:eastAsia="Arial" w:cs="Arial"/>
+          <w:b w:val="0"/>
+          <w:i w:val="0"/>
+        </w:rPr>
+        <w:t>☐ размещение приглашений в подходящих группах города не реже раза в месяц.</w:t>
       </w:r>
     </w:p>
     <w:p>
@@ -21135,7 +23631,7 @@
       </w:r>
     </w:p>
     <w:p>
-      <w:hyperlink r:id="rId19">
+      <w:hyperlink r:id="rId23">
         <w:r>
           <w:rPr>
             <w:color w:val="1F5E4A"/>
@@ -21489,7 +23985,7 @@
       <w:pPr>
         <w:spacing w:before="120"/>
       </w:pPr>
-      <w:hyperlink r:id="rId105">
+      <w:hyperlink r:id="rId115">
         <w:r>
           <w:rPr>
             <w:color w:val="1F5E4A"/>
@@ -22228,7 +24724,7 @@
         </w:rPr>
         <w:t xml:space="preserve">• </w:t>
       </w:r>
-      <w:hyperlink r:id="rId106">
+      <w:hyperlink r:id="rId116">
         <w:r>
           <w:rPr>
             <w:color w:val="1F5E4A"/>
@@ -22260,7 +24756,7 @@
         </w:rPr>
         <w:t xml:space="preserve">• </w:t>
       </w:r>
-      <w:hyperlink r:id="rId87">
+      <w:hyperlink r:id="rId96">
         <w:r>
           <w:rPr>
             <w:color w:val="1F5E4A"/>
@@ -22292,7 +24788,7 @@
         </w:rPr>
         <w:t xml:space="preserve">• </w:t>
       </w:r>
-      <w:hyperlink r:id="rId34">
+      <w:hyperlink r:id="rId41">
         <w:r>
           <w:rPr>
             <w:color w:val="1F5E4A"/>
@@ -22324,7 +24820,7 @@
         </w:rPr>
         <w:t xml:space="preserve">• </w:t>
       </w:r>
-      <w:hyperlink r:id="rId65">
+      <w:hyperlink r:id="rId73">
         <w:r>
           <w:rPr>
             <w:color w:val="1F5E4A"/>
@@ -22394,7 +24890,7 @@
       <w:pPr>
         <w:spacing w:before="120"/>
       </w:pPr>
-      <w:hyperlink r:id="rId107">
+      <w:hyperlink r:id="rId117">
         <w:r>
           <w:rPr>
             <w:color w:val="1F5E4A"/>
@@ -22588,7 +25084,7 @@
       <w:pPr>
         <w:spacing w:before="120"/>
       </w:pPr>
-      <w:hyperlink r:id="rId108">
+      <w:hyperlink r:id="rId118">
         <w:r>
           <w:rPr>
             <w:color w:val="1F5E4A"/>
@@ -22653,7 +25149,7 @@
       </w:r>
     </w:p>
     <w:p>
-      <w:hyperlink r:id="rId109">
+      <w:hyperlink r:id="rId119">
         <w:r>
           <w:rPr>
             <w:color w:val="1F5E4A"/>
@@ -23198,7 +25694,7 @@
       </w:r>
     </w:p>
     <w:p>
-      <w:hyperlink r:id="rId21">
+      <w:hyperlink r:id="rId25">
         <w:r>
           <w:rPr>
             <w:color w:val="1F5E4A"/>
@@ -23391,7 +25887,7 @@
       <w:pPr>
         <w:spacing w:before="120"/>
       </w:pPr>
-      <w:hyperlink r:id="rId110">
+      <w:hyperlink r:id="rId120">
         <w:r>
           <w:rPr>
             <w:color w:val="1F5E4A"/>
@@ -23797,7 +26293,7 @@
       <w:pPr>
         <w:spacing w:before="120"/>
       </w:pPr>
-      <w:hyperlink r:id="rId111">
+      <w:hyperlink r:id="rId121">
         <w:r>
           <w:rPr>
             <w:color w:val="1F5E4A"/>
@@ -24054,7 +26550,7 @@
       <w:pPr>
         <w:spacing w:before="120"/>
       </w:pPr>
-      <w:hyperlink r:id="rId112">
+      <w:hyperlink r:id="rId122">
         <w:r>
           <w:rPr>
             <w:color w:val="1F5E4A"/>
@@ -24091,6 +26587,42 @@
           <w:i w:val="0"/>
         </w:rPr>
         <w:t>Стандарт относится к любой регулярной программе юнита: коллективной медитации, открытой встрече, лекции с практикой.</w:t>
+      </w:r>
+    </w:p>
+    <w:p>
+      <w:pPr>
+        <w:pStyle w:val="Heading3"/>
+      </w:pPr>
+      <w:r>
+        <w:t>Ритм и развитие программ</w:t>
+      </w:r>
+    </w:p>
+    <w:p>
+      <w:r>
+        <w:rPr>
+          <w:rFonts w:ascii="Arial" w:hAnsi="Arial" w:eastAsia="Arial" w:cs="Arial"/>
+          <w:b w:val="0"/>
+          <w:i w:val="0"/>
+        </w:rPr>
+        <w:t xml:space="preserve">Проводите коллективную медитацию каждую неделю. Каждый месяц организуйте одну дополнительную программу: например, кино с обсуждением, поход или тематическую встречу. Выберите формат по интересам участников, назначьте ответственного, подготовьте приглашение, сценарий и заботу. После встречи соберите впечатления и выберите улучшение на следующий месяц. </w:t>
+      </w:r>
+      <w:hyperlink r:id="rId123">
+        <w:r>
+          <w:rPr>
+            <w:color w:val="1F5E4A"/>
+            <w:u w:val="single"/>
+            <w:rFonts w:ascii="Arial" w:hAnsi="Arial" w:eastAsia="Arial" w:cs="Arial"/>
+          </w:rPr>
+          <w:t>План дополнительной программы</w:t>
+        </w:r>
+      </w:hyperlink>
+      <w:r>
+        <w:rPr>
+          <w:rFonts w:ascii="Arial" w:hAnsi="Arial" w:eastAsia="Arial" w:cs="Arial"/>
+          <w:b w:val="0"/>
+          <w:i w:val="0"/>
+        </w:rPr>
+        <w:t>.</w:t>
       </w:r>
     </w:p>
     <w:p>
@@ -25229,7 +27761,7 @@
         </w:rPr>
         <w:t xml:space="preserve">Полная библиотека и вопросы для развития раздела находятся на странице </w:t>
       </w:r>
-      <w:hyperlink r:id="rId113">
+      <w:hyperlink r:id="rId124">
         <w:r>
           <w:rPr>
             <w:color w:val="1F5E4A"/>
@@ -25564,7 +28096,7 @@
         </w:rPr>
         <w:t xml:space="preserve">Результат разбора вносится в </w:t>
       </w:r>
-      <w:hyperlink r:id="rId22">
+      <w:hyperlink r:id="rId26">
         <w:r>
           <w:rPr>
             <w:color w:val="1F5E4A"/>
@@ -25662,7 +28194,7 @@
         </w:rPr>
         <w:t xml:space="preserve">Как вести человека дальше — в </w:t>
       </w:r>
-      <w:hyperlink r:id="rId34">
+      <w:hyperlink r:id="rId41">
         <w:r>
           <w:rPr>
             <w:color w:val="1F5E4A"/>
@@ -25680,7 +28212,7 @@
         </w:rPr>
         <w:t xml:space="preserve"> и </w:t>
       </w:r>
-      <w:hyperlink r:id="rId65">
+      <w:hyperlink r:id="rId73">
         <w:r>
           <w:rPr>
             <w:color w:val="1F5E4A"/>
@@ -25743,7 +28275,7 @@
       <w:pPr>
         <w:spacing w:before="120"/>
       </w:pPr>
-      <w:hyperlink r:id="rId114">
+      <w:hyperlink r:id="rId125">
         <w:r>
           <w:rPr>
             <w:color w:val="1F5E4A"/>
@@ -25901,7 +28433,7 @@
       <w:pPr>
         <w:spacing w:before="120"/>
       </w:pPr>
-      <w:hyperlink r:id="rId115">
+      <w:hyperlink r:id="rId126">
         <w:r>
           <w:rPr>
             <w:color w:val="1F5E4A"/>
@@ -27803,7 +30335,7 @@
         </w:rPr>
         <w:t xml:space="preserve">. Результат вносится в </w:t>
       </w:r>
-      <w:hyperlink r:id="rId89">
+      <w:hyperlink r:id="rId98">
         <w:r>
           <w:rPr>
             <w:color w:val="1F5E4A"/>
@@ -27866,7 +30398,7 @@
       <w:pPr>
         <w:spacing w:before="120"/>
       </w:pPr>
-      <w:hyperlink r:id="rId116">
+      <w:hyperlink r:id="rId127">
         <w:r>
           <w:rPr>
             <w:color w:val="1F5E4A"/>
@@ -28392,7 +30924,7 @@
       <w:pPr>
         <w:spacing w:before="120"/>
       </w:pPr>
-      <w:hyperlink r:id="rId117">
+      <w:hyperlink r:id="rId128">
         <w:r>
           <w:rPr>
             <w:color w:val="1F5E4A"/>
@@ -28589,7 +31121,7 @@
       <w:pPr>
         <w:spacing w:before="120"/>
       </w:pPr>
-      <w:hyperlink r:id="rId118">
+      <w:hyperlink r:id="rId129">
         <w:r>
           <w:rPr>
             <w:color w:val="1F5E4A"/>
@@ -28802,7 +31334,7 @@
       <w:pPr>
         <w:spacing w:before="120"/>
       </w:pPr>
-      <w:hyperlink r:id="rId119">
+      <w:hyperlink r:id="rId130">
         <w:r>
           <w:rPr>
             <w:color w:val="1F5E4A"/>
@@ -29029,7 +31561,7 @@
       <w:pPr>
         <w:spacing w:before="120"/>
       </w:pPr>
-      <w:hyperlink r:id="rId120">
+      <w:hyperlink r:id="rId131">
         <w:r>
           <w:rPr>
             <w:color w:val="1F5E4A"/>
@@ -29301,7 +31833,7 @@
       <w:pPr>
         <w:spacing w:before="120"/>
       </w:pPr>
-      <w:hyperlink r:id="rId121">
+      <w:hyperlink r:id="rId132">
         <w:r>
           <w:rPr>
             <w:color w:val="1F5E4A"/>
@@ -29817,7 +32349,7 @@
       </w:r>
     </w:p>
     <w:p>
-      <w:hyperlink r:id="rId25">
+      <w:hyperlink r:id="rId29">
         <w:r>
           <w:rPr>
             <w:color w:val="1F5E4A"/>
@@ -30004,7 +32536,7 @@
       <w:pPr>
         <w:spacing w:before="120"/>
       </w:pPr>
-      <w:hyperlink r:id="rId122">
+      <w:hyperlink r:id="rId133">
         <w:r>
           <w:rPr>
             <w:color w:val="1F5E4A"/>
@@ -31219,7 +33751,7 @@
       <w:pPr>
         <w:spacing w:before="120"/>
       </w:pPr>
-      <w:hyperlink r:id="rId123">
+      <w:hyperlink r:id="rId134">
         <w:r>
           <w:rPr>
             <w:color w:val="1F5E4A"/>
@@ -32732,7 +35264,7 @@
       <w:pPr>
         <w:spacing w:before="120"/>
       </w:pPr>
-      <w:hyperlink r:id="rId124">
+      <w:hyperlink r:id="rId135">
         <w:r>
           <w:rPr>
             <w:color w:val="1F5E4A"/>

</xml_diff>